<commit_message>
Part 2 out of 4 finished, Updated Dry up to Q8
</commit_message>
<xml_diff>
--- a/HW2_WET/ML Major 2.docx
+++ b/HW2_WET/ML Major 2.docx
@@ -1,6 +1,6 @@
 
 <file path=word/document.xml><?xml version="1.0" encoding="utf-8"?>
-<w:document xmlns:wpc="http://schemas.microsoft.com/office/word/2010/wordprocessingCanvas" xmlns:cx="http://schemas.microsoft.com/office/drawing/2014/chartex" xmlns:cx1="http://schemas.microsoft.com/office/drawing/2015/9/8/chartex" xmlns:cx2="http://schemas.microsoft.com/office/drawing/2015/10/21/chartex" xmlns:cx3="http://schemas.microsoft.com/office/drawing/2016/5/9/chartex" xmlns:cx4="http://schemas.microsoft.com/office/drawing/2016/5/10/chartex" xmlns:cx5="http://schemas.microsoft.com/office/drawing/2016/5/11/chartex" xmlns:cx6="http://schemas.microsoft.com/office/drawing/2016/5/12/chartex" xmlns:cx7="http://schemas.microsoft.com/office/drawing/2016/5/13/chartex" xmlns:cx8="http://schemas.microsoft.com/office/drawing/2016/5/14/chartex" xmlns:mc="http://schemas.openxmlformats.org/markup-compatibility/2006" xmlns:aink="http://schemas.microsoft.com/office/drawing/2016/ink" xmlns:am3d="http://schemas.microsoft.com/office/drawing/2017/model3d" xmlns:o="urn:schemas-microsoft-com:office:office" xmlns:oel="http://schemas.microsoft.com/office/2019/extlst" xmlns:r="http://schemas.openxmlformats.org/officeDocument/2006/relationships" xmlns:m="http://schemas.openxmlformats.org/officeDocument/2006/math" xmlns:v="urn:schemas-microsoft-com:vml" xmlns:wp14="http://schemas.microsoft.com/office/word/2010/wordprocessingDrawing" xmlns:wp="http://schemas.openxmlformats.org/drawingml/2006/wordprocessingDrawing" xmlns:w10="urn:schemas-microsoft-com:office:word" xmlns:w="http://schemas.openxmlformats.org/wordprocessingml/2006/main" xmlns:w14="http://schemas.microsoft.com/office/word/2010/wordml" xmlns:w15="http://schemas.microsoft.com/office/word/2012/wordml" xmlns:w16cex="http://schemas.microsoft.com/office/word/2018/wordml/cex" xmlns:w16cid="http://schemas.microsoft.com/office/word/2016/wordml/cid" xmlns:w16="http://schemas.microsoft.com/office/word/2018/wordml" xmlns:w16sdtdh="http://schemas.microsoft.com/office/word/2020/wordml/sdtdatahash" xmlns:w16se="http://schemas.microsoft.com/office/word/2015/wordml/symex" xmlns:wpg="http://schemas.microsoft.com/office/word/2010/wordprocessingGroup" xmlns:wpi="http://schemas.microsoft.com/office/word/2010/wordprocessingInk" xmlns:wne="http://schemas.microsoft.com/office/word/2006/wordml" xmlns:wps="http://schemas.microsoft.com/office/word/2010/wordprocessingShape" mc:Ignorable="w14 w15 w16se w16cid w16 w16cex w16sdtdh wp14">
+<w:document xmlns:wpc="http://schemas.microsoft.com/office/word/2010/wordprocessingCanvas" xmlns:cx="http://schemas.microsoft.com/office/drawing/2014/chartex" xmlns:cx1="http://schemas.microsoft.com/office/drawing/2015/9/8/chartex" xmlns:cx2="http://schemas.microsoft.com/office/drawing/2015/10/21/chartex" xmlns:cx3="http://schemas.microsoft.com/office/drawing/2016/5/9/chartex" xmlns:cx4="http://schemas.microsoft.com/office/drawing/2016/5/10/chartex" xmlns:cx5="http://schemas.microsoft.com/office/drawing/2016/5/11/chartex" xmlns:cx6="http://schemas.microsoft.com/office/drawing/2016/5/12/chartex" xmlns:cx7="http://schemas.microsoft.com/office/drawing/2016/5/13/chartex" xmlns:cx8="http://schemas.microsoft.com/office/drawing/2016/5/14/chartex" xmlns:mc="http://schemas.openxmlformats.org/markup-compatibility/2006" xmlns:aink="http://schemas.microsoft.com/office/drawing/2016/ink" xmlns:am3d="http://schemas.microsoft.com/office/drawing/2017/model3d" xmlns:o="urn:schemas-microsoft-com:office:office" xmlns:oel="http://schemas.microsoft.com/office/2019/extlst" xmlns:r="http://schemas.openxmlformats.org/officeDocument/2006/relationships" xmlns:m="http://schemas.openxmlformats.org/officeDocument/2006/math" xmlns:v="urn:schemas-microsoft-com:vml" xmlns:wp14="http://schemas.microsoft.com/office/word/2010/wordprocessingDrawing" xmlns:wp="http://schemas.openxmlformats.org/drawingml/2006/wordprocessingDrawing" xmlns:w10="urn:schemas-microsoft-com:office:word" xmlns:w="http://schemas.openxmlformats.org/wordprocessingml/2006/main" xmlns:w14="http://schemas.microsoft.com/office/word/2010/wordml" xmlns:w15="http://schemas.microsoft.com/office/word/2012/wordml" xmlns:w16cex="http://schemas.microsoft.com/office/word/2018/wordml/cex" xmlns:w16cid="http://schemas.microsoft.com/office/word/2016/wordml/cid" xmlns:w16="http://schemas.microsoft.com/office/word/2018/wordml" xmlns:w16du="http://schemas.microsoft.com/office/word/2023/wordml/word16du" xmlns:w16sdtdh="http://schemas.microsoft.com/office/word/2020/wordml/sdtdatahash" xmlns:w16se="http://schemas.microsoft.com/office/word/2015/wordml/symex" xmlns:wpg="http://schemas.microsoft.com/office/word/2010/wordprocessingGroup" xmlns:wpi="http://schemas.microsoft.com/office/word/2010/wordprocessingInk" xmlns:wne="http://schemas.microsoft.com/office/word/2006/wordml" xmlns:wps="http://schemas.microsoft.com/office/word/2010/wordprocessingShape" mc:Ignorable="w14 w15 w16se w16cid w16 w16cex w16sdtdh w16du wp14">
   <w:body>
     <w:p>
       <w:pPr>
@@ -172,8 +172,16 @@
       <w:r>
         <w:rPr>
           <w:rFonts w:asciiTheme="minorBidi" w:hAnsiTheme="minorBidi"/>
-        </w:rPr>
-        <w:t xml:space="preserve">(Q1) Train a k-NN model using </w:t>
+          <w:b/>
+          <w:bCs/>
+        </w:rPr>
+        <w:t>(Q1)</w:t>
+      </w:r>
+      <w:r>
+        <w:rPr>
+          <w:rFonts w:asciiTheme="minorBidi" w:hAnsiTheme="minorBidi"/>
+        </w:rPr>
+        <w:t xml:space="preserve"> Train a k-NN model using </w:t>
       </w:r>
       <w:r>
         <w:rPr>
@@ -197,6 +205,7 @@
       <w:r>
         <w:rPr>
           <w:rFonts w:asciiTheme="minorBidi" w:hAnsiTheme="minorBidi"/>
+          <w:noProof/>
         </w:rPr>
         <w:drawing>
           <wp:inline distT="0" distB="0" distL="0" distR="0" wp14:anchorId="040FE2E7" wp14:editId="591EBDF9">
@@ -214,7 +223,7 @@
                     <pic:cNvPicPr/>
                   </pic:nvPicPr>
                   <pic:blipFill rotWithShape="1">
-                    <a:blip r:embed="rId5"/>
+                    <a:blip r:embed="rId6"/>
                     <a:srcRect l="3437" r="11620" b="1090"/>
                     <a:stretch/>
                   </pic:blipFill>
@@ -300,49 +309,92 @@
       <w:r>
         <w:rPr>
           <w:rFonts w:asciiTheme="minorBidi" w:hAnsiTheme="minorBidi"/>
-        </w:rPr>
-        <w:t xml:space="preserve">(Q2) Answer: Which </w:t>
-      </w:r>
-      <w:r>
-        <w:rPr>
-          <w:rFonts w:asciiTheme="minorBidi" w:hAnsiTheme="minorBidi"/>
-        </w:rPr>
-        <w:t>k</w:t>
-      </w:r>
-      <w:r>
-        <w:rPr>
-          <w:rFonts w:asciiTheme="minorBidi" w:hAnsiTheme="minorBidi"/>
-        </w:rPr>
-        <w:t xml:space="preserve"> is the best? What are its average training and validation accuracies (estimated by cross-val.)? Which </w:t>
-      </w:r>
-      <w:r>
-        <w:rPr>
-          <w:rFonts w:asciiTheme="minorBidi" w:hAnsiTheme="minorBidi"/>
-        </w:rPr>
-        <w:t>k</w:t>
-      </w:r>
-      <w:r>
-        <w:rPr>
-          <w:rFonts w:asciiTheme="minorBidi" w:hAnsiTheme="minorBidi"/>
-        </w:rPr>
-        <w:t xml:space="preserve"> values cause overfitting and underfitting and why?</w:t>
-      </w:r>
-    </w:p>
-    <w:p>
-      <w:pPr>
-        <w:rPr>
-          <w:rFonts w:asciiTheme="minorBidi" w:hAnsiTheme="minorBidi"/>
-          <w:color w:val="156082" w:themeColor="accent1"/>
-          <w:lang w:val="en-US"/>
-        </w:rPr>
-      </w:pPr>
-      <w:r>
-        <w:rPr>
-          <w:rFonts w:asciiTheme="minorBidi" w:hAnsiTheme="minorBidi"/>
-          <w:color w:val="156082" w:themeColor="accent1"/>
-          <w:lang w:val="en-US"/>
-        </w:rPr>
-        <w:t>We choose the best k by finding the k that provides the best validation accuracy because the validation error is close to the classifier error. The best k for predicting the spread class using PCR_04 and PCR_09 is k=11 with average training and validation accuracy 84%</w:t>
+          <w:b/>
+          <w:bCs/>
+        </w:rPr>
+        <w:t>(Q2)</w:t>
+      </w:r>
+      <w:r>
+        <w:rPr>
+          <w:rFonts w:asciiTheme="minorBidi" w:hAnsiTheme="minorBidi"/>
+        </w:rPr>
+        <w:t xml:space="preserve"> Answer: Which k is the best? What are its average training and validation accuracies (estimated by cross-val.)? Which k values cause overfitting and underfitting and why?</w:t>
+      </w:r>
+    </w:p>
+    <w:p>
+      <w:pPr>
+        <w:rPr>
+          <w:rFonts w:asciiTheme="minorBidi" w:hAnsiTheme="minorBidi"/>
+          <w:color w:val="156082" w:themeColor="accent1"/>
+          <w:lang w:val="en-US"/>
+        </w:rPr>
+      </w:pPr>
+      <w:r>
+        <w:rPr>
+          <w:rFonts w:asciiTheme="minorBidi" w:hAnsiTheme="minorBidi"/>
+          <w:color w:val="156082" w:themeColor="accent1"/>
+          <w:lang w:val="en-US"/>
+        </w:rPr>
+        <w:t xml:space="preserve">We choose the best k by finding the k that provides the best validation accuracy because the validation error </w:t>
+      </w:r>
+      <w:r>
+        <w:rPr>
+          <w:rFonts w:asciiTheme="minorBidi" w:hAnsiTheme="minorBidi"/>
+          <w:color w:val="156082" w:themeColor="accent1"/>
+          <w:lang w:val="en-US"/>
+        </w:rPr>
+        <w:t xml:space="preserve">tells us how good a model </w:t>
+      </w:r>
+      <w:proofErr w:type="gramStart"/>
+      <w:r>
+        <w:rPr>
+          <w:rFonts w:asciiTheme="minorBidi" w:hAnsiTheme="minorBidi"/>
+          <w:color w:val="156082" w:themeColor="accent1"/>
+          <w:lang w:val="en-US"/>
+        </w:rPr>
+        <w:t xml:space="preserve">generalizes </w:t>
+      </w:r>
+      <w:r>
+        <w:rPr>
+          <w:rFonts w:asciiTheme="minorBidi" w:hAnsiTheme="minorBidi"/>
+          <w:color w:val="156082" w:themeColor="accent1"/>
+          <w:lang w:val="en-US"/>
+        </w:rPr>
+        <w:t>.</w:t>
+      </w:r>
+      <w:proofErr w:type="gramEnd"/>
+    </w:p>
+    <w:p>
+      <w:pPr>
+        <w:rPr>
+          <w:rFonts w:asciiTheme="minorBidi" w:hAnsiTheme="minorBidi"/>
+          <w:color w:val="156082" w:themeColor="accent1"/>
+          <w:lang w:val="en-US"/>
+        </w:rPr>
+      </w:pPr>
+      <w:r>
+        <w:rPr>
+          <w:rFonts w:asciiTheme="minorBidi" w:hAnsiTheme="minorBidi"/>
+          <w:color w:val="156082" w:themeColor="accent1"/>
+          <w:lang w:val="en-US"/>
+        </w:rPr>
+        <w:t>The best k for predicting the spread class using PCR_04 and PCR_09 is k=11 with average training and validation accuracy</w:t>
+      </w:r>
+      <w:r>
+        <w:rPr>
+          <w:rFonts w:asciiTheme="minorBidi" w:hAnsiTheme="minorBidi"/>
+          <w:color w:val="156082" w:themeColor="accent1"/>
+          <w:lang w:val="en-US"/>
+        </w:rPr>
+        <w:t xml:space="preserve"> both being</w:t>
+      </w:r>
+      <w:r>
+        <w:rPr>
+          <w:rFonts w:asciiTheme="minorBidi" w:hAnsiTheme="minorBidi"/>
+          <w:color w:val="156082" w:themeColor="accent1"/>
+          <w:lang w:val="en-US"/>
+        </w:rPr>
+        <w:t xml:space="preserve"> 84%</w:t>
       </w:r>
       <w:r>
         <w:rPr>
@@ -393,7 +445,55 @@
           <w:color w:val="156082" w:themeColor="accent1"/>
           <w:lang w:val="en-US"/>
         </w:rPr>
-        <w:t>Underfitting occurs when the model tries to be too general and tries to find too many neighbors that may be far away from the original point location. By this, the model gets in both training and validation datasets a very low accuracy. We can see that in the k’s that are greater than 85, that have both training and validation datasets a very low accuracy</w:t>
+        <w:t xml:space="preserve">Underfitting occurs when the model tries to be too general and tries to find too many neighbors that may be far away from the original point </w:t>
+      </w:r>
+      <w:r>
+        <w:rPr>
+          <w:rFonts w:asciiTheme="minorBidi" w:hAnsiTheme="minorBidi"/>
+          <w:color w:val="156082" w:themeColor="accent1"/>
+          <w:lang w:val="en-US"/>
+        </w:rPr>
+        <w:t>we are trying to classify</w:t>
+      </w:r>
+      <w:r>
+        <w:rPr>
+          <w:rFonts w:asciiTheme="minorBidi" w:hAnsiTheme="minorBidi"/>
+          <w:color w:val="156082" w:themeColor="accent1"/>
+          <w:lang w:val="en-US"/>
+        </w:rPr>
+        <w:t>. By this, the model gets in both training and validation datasets a very low accuracy. We can see that in the k’s that are greater than 85, t</w:t>
+      </w:r>
+      <w:r>
+        <w:rPr>
+          <w:rFonts w:asciiTheme="minorBidi" w:hAnsiTheme="minorBidi"/>
+          <w:color w:val="156082" w:themeColor="accent1"/>
+          <w:lang w:val="en-US"/>
+        </w:rPr>
+        <w:t>hey</w:t>
+      </w:r>
+      <w:r>
+        <w:rPr>
+          <w:rFonts w:asciiTheme="minorBidi" w:hAnsiTheme="minorBidi"/>
+          <w:color w:val="156082" w:themeColor="accent1"/>
+          <w:lang w:val="en-US"/>
+        </w:rPr>
+        <w:t xml:space="preserve"> have both </w:t>
+      </w:r>
+      <w:r>
+        <w:rPr>
+          <w:rFonts w:asciiTheme="minorBidi" w:hAnsiTheme="minorBidi"/>
+          <w:color w:val="156082" w:themeColor="accent1"/>
+          <w:lang w:val="en-US"/>
+        </w:rPr>
+        <w:t xml:space="preserve">very low </w:t>
+      </w:r>
+      <w:r>
+        <w:rPr>
+          <w:rFonts w:asciiTheme="minorBidi" w:hAnsiTheme="minorBidi"/>
+          <w:color w:val="156082" w:themeColor="accent1"/>
+          <w:lang w:val="en-US"/>
+        </w:rPr>
+        <w:t>training and validation datasets accuracy</w:t>
       </w:r>
       <w:r>
         <w:rPr>
@@ -415,11 +515,12 @@
       <w:r>
         <w:rPr>
           <w:rFonts w:asciiTheme="minorBidi" w:hAnsiTheme="minorBidi"/>
+          <w:noProof/>
         </w:rPr>
         <w:drawing>
-          <wp:inline distT="0" distB="0" distL="0" distR="0" wp14:anchorId="7AD9E17C" wp14:editId="4F048576">
-            <wp:extent cx="2762216" cy="2237362"/>
-            <wp:effectExtent l="0" t="0" r="0" b="0"/>
+          <wp:inline distT="0" distB="0" distL="0" distR="0" wp14:anchorId="7AD9E17C" wp14:editId="782A1955">
+            <wp:extent cx="2926080" cy="2370090"/>
+            <wp:effectExtent l="0" t="0" r="7620" b="0"/>
             <wp:docPr id="1140207899" name="Picture 1"/>
             <wp:cNvGraphicFramePr>
               <a:graphicFrameLocks xmlns:a="http://schemas.openxmlformats.org/drawingml/2006/main" noChangeAspect="1"/>
@@ -432,14 +533,14 @@
                     <pic:cNvPicPr/>
                   </pic:nvPicPr>
                   <pic:blipFill rotWithShape="1">
-                    <a:blip r:embed="rId6"/>
+                    <a:blip r:embed="rId7"/>
                     <a:srcRect l="1801"/>
                     <a:stretch/>
                   </pic:blipFill>
                   <pic:spPr bwMode="auto">
                     <a:xfrm>
                       <a:off x="0" y="0"/>
-                      <a:ext cx="2791473" cy="2261060"/>
+                      <a:ext cx="2962443" cy="2399543"/>
                     </a:xfrm>
                     <a:prstGeom prst="rect">
                       <a:avLst/>
@@ -470,12 +571,13 @@
       <w:r>
         <w:rPr>
           <w:rFonts w:asciiTheme="minorBidi" w:hAnsiTheme="minorBidi"/>
+          <w:noProof/>
           <w:lang w:val="en-US"/>
         </w:rPr>
         <w:drawing>
-          <wp:inline distT="0" distB="0" distL="0" distR="0" wp14:anchorId="099B922C" wp14:editId="24306451">
-            <wp:extent cx="3980029" cy="2386316"/>
-            <wp:effectExtent l="0" t="0" r="0" b="1905"/>
+          <wp:inline distT="0" distB="0" distL="0" distR="0" wp14:anchorId="099B922C" wp14:editId="7099B0F3">
+            <wp:extent cx="3927098" cy="2354580"/>
+            <wp:effectExtent l="0" t="0" r="0" b="7620"/>
             <wp:docPr id="1506559503" name="Picture 1"/>
             <wp:cNvGraphicFramePr>
               <a:graphicFrameLocks xmlns:a="http://schemas.openxmlformats.org/drawingml/2006/main" noChangeAspect="1"/>
@@ -488,7 +590,7 @@
                     <pic:cNvPicPr/>
                   </pic:nvPicPr>
                   <pic:blipFill>
-                    <a:blip r:embed="rId7"/>
+                    <a:blip r:embed="rId8"/>
                     <a:stretch>
                       <a:fillRect/>
                     </a:stretch>
@@ -496,7 +598,7 @@
                   <pic:spPr>
                     <a:xfrm>
                       <a:off x="0" y="0"/>
-                      <a:ext cx="3999800" cy="2398170"/>
+                      <a:ext cx="3968963" cy="2379681"/>
                     </a:xfrm>
                     <a:prstGeom prst="rect">
                       <a:avLst/>
@@ -519,13 +621,14 @@
     </w:p>
     <w:p>
       <w:r>
-        <w:t xml:space="preserve">(Q3) Use the optimal </w:t>
-      </w:r>
-      <w:r>
-        <w:t>k</w:t>
-      </w:r>
-      <w:r>
-        <w:t xml:space="preserve"> value you found and retrain a k-NN model on all the training samples. In your report: plot the decision regions of this final model (using visualize_clf) and write its test accuracy (computed on the separate test split) of this model.</w:t>
+        <w:rPr>
+          <w:b/>
+          <w:bCs/>
+        </w:rPr>
+        <w:t>(Q3)</w:t>
+      </w:r>
+      <w:r>
+        <w:t xml:space="preserve"> Use the optimal k value you found and retrain a k-NN model on all the training samples. In your report: plot the decision regions of this final model (using visualize_clf) and write its test accuracy (computed on the separate test split) of this model.</w:t>
       </w:r>
     </w:p>
     <w:p>
@@ -551,6 +654,7 @@
       <w:r>
         <w:rPr>
           <w:rFonts w:asciiTheme="minorBidi" w:hAnsiTheme="minorBidi"/>
+          <w:noProof/>
           <w:lang w:val="en-US"/>
         </w:rPr>
         <w:drawing>
@@ -569,7 +673,7 @@
                     <pic:cNvPicPr/>
                   </pic:nvPicPr>
                   <pic:blipFill>
-                    <a:blip r:embed="rId8"/>
+                    <a:blip r:embed="rId9"/>
                     <a:stretch>
                       <a:fillRect/>
                     </a:stretch>
@@ -621,39 +725,211 @@
           <w:color w:val="156082" w:themeColor="accent1"/>
           <w:lang w:val="en-US"/>
         </w:rPr>
-        <w:t>est</w:t>
-      </w:r>
-      <w:r>
-        <w:rPr>
-          <w:rFonts w:asciiTheme="minorBidi" w:hAnsiTheme="minorBidi"/>
-          <w:color w:val="156082" w:themeColor="accent1"/>
-          <w:lang w:val="en-US"/>
-        </w:rPr>
-        <w:t xml:space="preserve"> accuracy score: 8</w:t>
-      </w:r>
-      <w:r>
-        <w:rPr>
-          <w:rFonts w:asciiTheme="minorBidi" w:hAnsiTheme="minorBidi"/>
-          <w:color w:val="156082" w:themeColor="accent1"/>
-          <w:lang w:val="en-US"/>
-        </w:rPr>
-        <w:t>2</w:t>
-      </w:r>
-      <w:r>
-        <w:rPr>
-          <w:rFonts w:asciiTheme="minorBidi" w:hAnsiTheme="minorBidi"/>
-          <w:color w:val="156082" w:themeColor="accent1"/>
-          <w:lang w:val="en-US"/>
-        </w:rPr>
-        <w:t>.</w:t>
-      </w:r>
-      <w:r>
-        <w:rPr>
-          <w:rFonts w:asciiTheme="minorBidi" w:hAnsiTheme="minorBidi"/>
-          <w:color w:val="156082" w:themeColor="accent1"/>
-          <w:lang w:val="en-US"/>
-        </w:rPr>
-        <w:t>8</w:t>
+        <w:t>est accuracy score: 82.8%</w:t>
+      </w:r>
+    </w:p>
+    <w:p>
+      <w:pPr>
+        <w:rPr>
+          <w:rFonts w:asciiTheme="minorBidi" w:hAnsiTheme="minorBidi"/>
+          <w:lang w:val="en-US"/>
+        </w:rPr>
+      </w:pPr>
+    </w:p>
+    <w:p>
+      <w:r>
+        <w:rPr>
+          <w:b/>
+          <w:bCs/>
+        </w:rPr>
+        <w:t>(Q4)</w:t>
+      </w:r>
+      <w:r>
+        <w:t xml:space="preserve"> Compare the boundaries of the two models you have trained in (Q1) and (Q3). Discuss the results and the exhibited behaviors (2-3 sentences).</w:t>
+      </w:r>
+    </w:p>
+    <w:p>
+      <w:pPr>
+        <w:rPr>
+          <w:rFonts w:asciiTheme="minorBidi" w:hAnsiTheme="minorBidi"/>
+          <w:color w:val="156082" w:themeColor="accent1"/>
+          <w:lang w:val="en-US"/>
+        </w:rPr>
+      </w:pPr>
+      <w:r>
+        <w:rPr>
+          <w:rFonts w:asciiTheme="minorBidi" w:hAnsiTheme="minorBidi"/>
+          <w:color w:val="156082" w:themeColor="accent1"/>
+          <w:lang w:val="en-US"/>
+        </w:rPr>
+        <w:t>Comparison between k=1 to k=11:</w:t>
+      </w:r>
+    </w:p>
+    <w:p>
+      <w:pPr>
+        <w:rPr>
+          <w:rFonts w:asciiTheme="minorBidi" w:hAnsiTheme="minorBidi"/>
+          <w:color w:val="156082" w:themeColor="accent1"/>
+          <w:lang w:val="en-US"/>
+        </w:rPr>
+      </w:pPr>
+      <w:r>
+        <w:rPr>
+          <w:rFonts w:asciiTheme="minorBidi" w:hAnsiTheme="minorBidi"/>
+          <w:color w:val="156082" w:themeColor="accent1"/>
+          <w:lang w:val="en-US"/>
+        </w:rPr>
+        <w:t>As we can clearly see, the k=11 graph is much smoother and less sensitive for outliers, which gives us much better performance</w:t>
+      </w:r>
+      <w:r>
+        <w:rPr>
+          <w:rFonts w:asciiTheme="minorBidi" w:hAnsiTheme="minorBidi"/>
+          <w:color w:val="156082" w:themeColor="accent1"/>
+          <w:lang w:val="en-US"/>
+        </w:rPr>
+        <w:t xml:space="preserve"> and generalization.</w:t>
+      </w:r>
+    </w:p>
+    <w:p>
+      <w:pPr>
+        <w:rPr>
+          <w:rFonts w:asciiTheme="minorBidi" w:hAnsiTheme="minorBidi"/>
+          <w:color w:val="156082" w:themeColor="accent1"/>
+          <w:lang w:val="en-US"/>
+        </w:rPr>
+      </w:pPr>
+      <w:r>
+        <w:rPr>
+          <w:rFonts w:asciiTheme="minorBidi" w:hAnsiTheme="minorBidi"/>
+          <w:color w:val="156082" w:themeColor="accent1"/>
+          <w:lang w:val="en-US"/>
+        </w:rPr>
+        <w:t>Unlike the k=11, the k=1 model uses only one neighbor</w:t>
+      </w:r>
+      <w:r>
+        <w:rPr>
+          <w:rFonts w:asciiTheme="minorBidi" w:hAnsiTheme="minorBidi"/>
+          <w:color w:val="156082" w:themeColor="accent1"/>
+          <w:lang w:val="en-US"/>
+        </w:rPr>
+        <w:t>,</w:t>
+      </w:r>
+      <w:r>
+        <w:rPr>
+          <w:rFonts w:asciiTheme="minorBidi" w:hAnsiTheme="minorBidi"/>
+          <w:color w:val="156082" w:themeColor="accent1"/>
+          <w:lang w:val="en-US"/>
+        </w:rPr>
+        <w:t xml:space="preserve"> in </w:t>
+      </w:r>
+      <w:proofErr w:type="spellStart"/>
+      <w:r>
+        <w:rPr>
+          <w:rFonts w:asciiTheme="minorBidi" w:hAnsiTheme="minorBidi"/>
+          <w:color w:val="156082" w:themeColor="accent1"/>
+          <w:lang w:val="en-US"/>
+        </w:rPr>
+        <w:t>it’s</w:t>
+      </w:r>
+      <w:proofErr w:type="spellEnd"/>
+      <w:r>
+        <w:rPr>
+          <w:rFonts w:asciiTheme="minorBidi" w:hAnsiTheme="minorBidi"/>
+          <w:color w:val="156082" w:themeColor="accent1"/>
+          <w:lang w:val="en-US"/>
+        </w:rPr>
+        <w:t xml:space="preserve"> graph we can see many different small areas of color changing around single points that may count as outliers in the real dataset. That happens because this time the model uses only the 1 nearest neighbor for the predictions and does</w:t>
+      </w:r>
+      <w:r>
+        <w:rPr>
+          <w:rFonts w:asciiTheme="minorBidi" w:hAnsiTheme="minorBidi"/>
+          <w:color w:val="156082" w:themeColor="accent1"/>
+          <w:lang w:val="en-US"/>
+        </w:rPr>
+        <w:t>n’t</w:t>
+      </w:r>
+      <w:r>
+        <w:rPr>
+          <w:rFonts w:asciiTheme="minorBidi" w:hAnsiTheme="minorBidi"/>
+          <w:color w:val="156082" w:themeColor="accent1"/>
+          <w:lang w:val="en-US"/>
+        </w:rPr>
+        <w:t xml:space="preserve"> generalize it by checking the data and the area that the point itself found in.</w:t>
+      </w:r>
+    </w:p>
+    <w:p>
+      <w:pPr>
+        <w:rPr>
+          <w:rFonts w:asciiTheme="minorBidi" w:hAnsiTheme="minorBidi"/>
+          <w:lang w:val="en-US"/>
+        </w:rPr>
+      </w:pPr>
+    </w:p>
+    <w:p>
+      <w:pPr>
+        <w:rPr>
+          <w:rFonts w:asciiTheme="minorBidi" w:hAnsiTheme="minorBidi"/>
+          <w:lang w:val="en-US"/>
+        </w:rPr>
+      </w:pPr>
+    </w:p>
+    <w:p>
+      <w:pPr>
+        <w:rPr>
+          <w:rFonts w:asciiTheme="minorBidi" w:hAnsiTheme="minorBidi"/>
+          <w:lang w:val="en-US"/>
+        </w:rPr>
+      </w:pPr>
+    </w:p>
+    <w:p>
+      <w:pPr>
+        <w:rPr>
+          <w:rFonts w:asciiTheme="minorBidi" w:hAnsiTheme="minorBidi"/>
+          <w:lang w:val="en-US"/>
+        </w:rPr>
+      </w:pPr>
+      <w:r>
+        <w:rPr>
+          <w:b/>
+          <w:bCs/>
+        </w:rPr>
+        <w:t>(Q5)</w:t>
+      </w:r>
+      <w:r>
+        <w:t xml:space="preserve"> Train a model with ID3 and max_depth=3 (not including the root level; use the entire training set, i.e., all the features after preprocessing from all the training samples). What is the training accuracy? Visualize the trained tree using plot_tree (provide feature and class names; use filled=True) and attach the plot to your report. The plot should be readable!</w:t>
+      </w:r>
+    </w:p>
+    <w:p>
+      <w:pPr>
+        <w:rPr>
+          <w:rFonts w:asciiTheme="minorBidi" w:hAnsiTheme="minorBidi"/>
+          <w:lang w:val="en-US"/>
+        </w:rPr>
+      </w:pPr>
+    </w:p>
+    <w:p>
+      <w:pPr>
+        <w:rPr>
+          <w:rFonts w:asciiTheme="minorBidi" w:hAnsiTheme="minorBidi"/>
+          <w:color w:val="156082" w:themeColor="accent1"/>
+          <w:lang w:val="en-US"/>
+        </w:rPr>
+      </w:pPr>
+      <w:r>
+        <w:rPr>
+          <w:rFonts w:asciiTheme="minorBidi" w:hAnsiTheme="minorBidi"/>
+          <w:color w:val="156082" w:themeColor="accent1"/>
+          <w:lang w:val="en-US"/>
+        </w:rPr>
+        <w:t>The training accuracy is 69</w:t>
+      </w:r>
+      <w:r>
+        <w:rPr>
+          <w:rFonts w:asciiTheme="minorBidi" w:hAnsiTheme="minorBidi"/>
+          <w:color w:val="156082" w:themeColor="accent1"/>
+          <w:lang w:val="en-US"/>
+        </w:rPr>
+        <w:t xml:space="preserve"> </w:t>
       </w:r>
       <w:r>
         <w:rPr>
@@ -668,179 +944,6 @@
       <w:pPr>
         <w:rPr>
           <w:rFonts w:asciiTheme="minorBidi" w:hAnsiTheme="minorBidi"/>
-          <w:lang w:val="en-US"/>
-        </w:rPr>
-      </w:pPr>
-    </w:p>
-    <w:p>
-      <w:r>
-        <w:t>(Q4) Compare the boundaries of the two models you have trained in (Q1) and (Q3). Discuss the results and the exhibited behaviors (2-3 sentences).</w:t>
-      </w:r>
-    </w:p>
-    <w:p>
-      <w:pPr>
-        <w:rPr>
-          <w:rFonts w:asciiTheme="minorBidi" w:hAnsiTheme="minorBidi"/>
-          <w:color w:val="156082" w:themeColor="accent1"/>
-          <w:lang w:val="en-US"/>
-        </w:rPr>
-      </w:pPr>
-      <w:r>
-        <w:rPr>
-          <w:rFonts w:asciiTheme="minorBidi" w:hAnsiTheme="minorBidi"/>
-          <w:color w:val="156082" w:themeColor="accent1"/>
-          <w:lang w:val="en-US"/>
-        </w:rPr>
-        <w:t>Comparison between k=1 to k=11:</w:t>
-      </w:r>
-    </w:p>
-    <w:p>
-      <w:pPr>
-        <w:rPr>
-          <w:rFonts w:asciiTheme="minorBidi" w:hAnsiTheme="minorBidi"/>
-          <w:color w:val="156082" w:themeColor="accent1"/>
-          <w:lang w:val="en-US"/>
-        </w:rPr>
-      </w:pPr>
-      <w:r>
-        <w:rPr>
-          <w:rFonts w:asciiTheme="minorBidi" w:hAnsiTheme="minorBidi"/>
-          <w:color w:val="156082" w:themeColor="accent1"/>
-          <w:lang w:val="en-US"/>
-        </w:rPr>
-        <w:t>As we can clearly see, the k=11 graph is much smoother and less sensitive for outliers, which gives us much better performance, and it's due to the fact the model uses 11 nearest neighbors to predict the label. Unlike the k=11, the k=1 model uses only one neighbor</w:t>
-      </w:r>
-      <w:r>
-        <w:rPr>
-          <w:rFonts w:asciiTheme="minorBidi" w:hAnsiTheme="minorBidi"/>
-          <w:color w:val="156082" w:themeColor="accent1"/>
-          <w:lang w:val="en-US"/>
-        </w:rPr>
-        <w:t>,</w:t>
-      </w:r>
-      <w:r>
-        <w:rPr>
-          <w:rFonts w:asciiTheme="minorBidi" w:hAnsiTheme="minorBidi"/>
-          <w:color w:val="156082" w:themeColor="accent1"/>
-          <w:lang w:val="en-US"/>
-        </w:rPr>
-        <w:t xml:space="preserve"> </w:t>
-      </w:r>
-      <w:r>
-        <w:rPr>
-          <w:rFonts w:asciiTheme="minorBidi" w:hAnsiTheme="minorBidi"/>
-          <w:color w:val="156082" w:themeColor="accent1"/>
-          <w:lang w:val="en-US"/>
-        </w:rPr>
-        <w:t xml:space="preserve">in </w:t>
-      </w:r>
-      <w:proofErr w:type="spellStart"/>
-      <w:r>
-        <w:rPr>
-          <w:rFonts w:asciiTheme="minorBidi" w:hAnsiTheme="minorBidi"/>
-          <w:color w:val="156082" w:themeColor="accent1"/>
-          <w:lang w:val="en-US"/>
-        </w:rPr>
-        <w:t>it’s</w:t>
-      </w:r>
-      <w:proofErr w:type="spellEnd"/>
-      <w:r>
-        <w:rPr>
-          <w:rFonts w:asciiTheme="minorBidi" w:hAnsiTheme="minorBidi"/>
-          <w:color w:val="156082" w:themeColor="accent1"/>
-          <w:lang w:val="en-US"/>
-        </w:rPr>
-        <w:t xml:space="preserve"> graph</w:t>
-      </w:r>
-      <w:r>
-        <w:rPr>
-          <w:rFonts w:asciiTheme="minorBidi" w:hAnsiTheme="minorBidi"/>
-          <w:color w:val="156082" w:themeColor="accent1"/>
-          <w:lang w:val="en-US"/>
-        </w:rPr>
-        <w:t xml:space="preserve"> we can see many different small areas of color changing around single points that may count as outliers in the real dataset. That happens because this time the model uses only the 1 nearest neighbor for the predictions and does</w:t>
-      </w:r>
-      <w:r>
-        <w:rPr>
-          <w:rFonts w:asciiTheme="minorBidi" w:hAnsiTheme="minorBidi"/>
-          <w:color w:val="156082" w:themeColor="accent1"/>
-          <w:lang w:val="en-US"/>
-        </w:rPr>
-        <w:t>n’t</w:t>
-      </w:r>
-      <w:r>
-        <w:rPr>
-          <w:rFonts w:asciiTheme="minorBidi" w:hAnsiTheme="minorBidi"/>
-          <w:color w:val="156082" w:themeColor="accent1"/>
-          <w:lang w:val="en-US"/>
-        </w:rPr>
-        <w:t xml:space="preserve"> generalize it by checking the data and the area that the point itself found in.</w:t>
-      </w:r>
-    </w:p>
-    <w:p>
-      <w:pPr>
-        <w:rPr>
-          <w:rFonts w:asciiTheme="minorBidi" w:hAnsiTheme="minorBidi"/>
-          <w:lang w:val="en-US"/>
-        </w:rPr>
-      </w:pPr>
-    </w:p>
-    <w:p>
-      <w:pPr>
-        <w:rPr>
-          <w:rFonts w:asciiTheme="minorBidi" w:hAnsiTheme="minorBidi"/>
-          <w:lang w:val="en-US"/>
-        </w:rPr>
-      </w:pPr>
-    </w:p>
-    <w:p>
-      <w:pPr>
-        <w:rPr>
-          <w:rFonts w:asciiTheme="minorBidi" w:hAnsiTheme="minorBidi"/>
-          <w:lang w:val="en-US"/>
-        </w:rPr>
-      </w:pPr>
-    </w:p>
-    <w:p>
-      <w:pPr>
-        <w:rPr>
-          <w:rFonts w:asciiTheme="minorBidi" w:hAnsiTheme="minorBidi"/>
-          <w:lang w:val="en-US"/>
-        </w:rPr>
-      </w:pPr>
-      <w:r>
-        <w:t>(Q5) Train a model with ID3 and max_depth=3 (not including the root level; use the entire training set, i.e., all the features after preprocessing from all the training samples). What is the training accuracy? Visualize the trained tree using plot_tree (provide feature and class names; use filled=True) and attach the plot to your report. The plot should be readable!</w:t>
-      </w:r>
-    </w:p>
-    <w:p>
-      <w:pPr>
-        <w:rPr>
-          <w:rFonts w:asciiTheme="minorBidi" w:hAnsiTheme="minorBidi"/>
-          <w:lang w:val="en-US"/>
-        </w:rPr>
-      </w:pPr>
-    </w:p>
-    <w:p>
-      <w:pPr>
-        <w:rPr>
-          <w:rFonts w:asciiTheme="minorBidi" w:hAnsiTheme="minorBidi"/>
-          <w:color w:val="156082" w:themeColor="accent1"/>
-          <w:lang w:val="en-US"/>
-        </w:rPr>
-      </w:pPr>
-      <w:r>
-        <w:rPr>
-          <w:rFonts w:asciiTheme="minorBidi" w:hAnsiTheme="minorBidi"/>
-          <w:color w:val="156082" w:themeColor="accent1"/>
-          <w:lang w:val="en-US"/>
-        </w:rPr>
-        <w:t>The training accuracy is 69.5%</w:t>
-      </w:r>
-    </w:p>
-    <w:p>
-      <w:pPr>
-        <w:rPr>
-          <w:rFonts w:asciiTheme="minorBidi" w:hAnsiTheme="minorBidi"/>
           <w:color w:val="000000" w:themeColor="text1"/>
           <w:lang w:val="en-US"/>
         </w:rPr>
@@ -852,10 +955,10 @@
           <w:lang w:val="en-US"/>
         </w:rPr>
         <w:drawing>
-          <wp:inline distT="0" distB="0" distL="0" distR="0" wp14:anchorId="4D5091EF" wp14:editId="7F852E40">
-            <wp:extent cx="5593404" cy="4267295"/>
-            <wp:effectExtent l="0" t="0" r="0" b="0"/>
-            <wp:docPr id="550017257" name="Picture 1"/>
+          <wp:inline distT="0" distB="0" distL="0" distR="0" wp14:anchorId="76D35873" wp14:editId="508F4F03">
+            <wp:extent cx="4857750" cy="3694173"/>
+            <wp:effectExtent l="0" t="0" r="0" b="1905"/>
+            <wp:docPr id="454643447" name="Picture 1"/>
             <wp:cNvGraphicFramePr>
               <a:graphicFrameLocks xmlns:a="http://schemas.openxmlformats.org/drawingml/2006/main" noChangeAspect="1"/>
             </wp:cNvGraphicFramePr>
@@ -863,30 +966,23 @@
               <a:graphicData uri="http://schemas.openxmlformats.org/drawingml/2006/picture">
                 <pic:pic xmlns:pic="http://schemas.openxmlformats.org/drawingml/2006/picture">
                   <pic:nvPicPr>
-                    <pic:cNvPr id="550017257" name=""/>
+                    <pic:cNvPr id="454643447" name=""/>
                     <pic:cNvPicPr/>
                   </pic:nvPicPr>
-                  <pic:blipFill rotWithShape="1">
-                    <a:blip r:embed="rId9"/>
-                    <a:srcRect r="28314"/>
-                    <a:stretch/>
+                  <pic:blipFill>
+                    <a:blip r:embed="rId10"/>
+                    <a:stretch>
+                      <a:fillRect/>
+                    </a:stretch>
                   </pic:blipFill>
-                  <pic:spPr bwMode="auto">
+                  <pic:spPr>
                     <a:xfrm>
                       <a:off x="0" y="0"/>
-                      <a:ext cx="5610033" cy="4279981"/>
+                      <a:ext cx="4880522" cy="3711491"/>
                     </a:xfrm>
                     <a:prstGeom prst="rect">
                       <a:avLst/>
                     </a:prstGeom>
-                    <a:ln>
-                      <a:noFill/>
-                    </a:ln>
-                    <a:extLst>
-                      <a:ext uri="{53640926-AAD7-44D8-BBD7-CCE9431645EC}">
-                        <a14:shadowObscured xmlns:a14="http://schemas.microsoft.com/office/drawing/2010/main"/>
-                      </a:ext>
-                    </a:extLst>
                   </pic:spPr>
                 </pic:pic>
               </a:graphicData>
@@ -986,19 +1082,31 @@
       <w:r>
         <w:rPr>
           <w:rFonts w:asciiTheme="minorBidi" w:hAnsiTheme="minorBidi"/>
-        </w:rPr>
-        <w:t xml:space="preserve">(Q6) Using 5-fold cross-validation, tune the two hyperparameters by performing a grid search (see GridSearchCV). Find the combination yielding the best validation error for predicting the risk class. You should: </w:t>
-      </w:r>
-    </w:p>
-    <w:p>
-      <w:pPr>
-        <w:rPr>
-          <w:rFonts w:asciiTheme="minorBidi" w:hAnsiTheme="minorBidi"/>
-        </w:rPr>
-      </w:pPr>
-      <w:r>
-        <w:rPr>
-          <w:rFonts w:asciiTheme="minorBidi" w:hAnsiTheme="minorBidi"/>
+          <w:b/>
+          <w:bCs/>
+        </w:rPr>
+        <w:lastRenderedPageBreak/>
+        <w:t>(Q6)</w:t>
+      </w:r>
+      <w:r>
+        <w:rPr>
+          <w:rFonts w:asciiTheme="minorBidi" w:hAnsiTheme="minorBidi"/>
+        </w:rPr>
+        <w:t xml:space="preserve"> Using 5-fold cross-validation, tune the two hyperparameters by performing a grid search (see GridSearchCV). Find the combination yielding the best validation error for predicting the risk class. You should: </w:t>
+      </w:r>
+    </w:p>
+    <w:p>
+      <w:pPr>
+        <w:rPr>
+          <w:rFonts w:asciiTheme="minorBidi" w:hAnsiTheme="minorBidi"/>
+        </w:rPr>
+      </w:pPr>
+      <w:proofErr w:type="gramStart"/>
+      <w:r>
+        <w:rPr>
+          <w:rFonts w:asciiTheme="minorBidi" w:hAnsiTheme="minorBidi"/>
+          <w:b/>
+          <w:bCs/>
         </w:rPr>
         <w:t>a.</w:t>
       </w:r>
@@ -1006,7 +1114,14 @@
         <w:rPr>
           <w:rFonts w:asciiTheme="minorBidi" w:hAnsiTheme="minorBidi"/>
         </w:rPr>
-        <w:t xml:space="preserve">Choose appropriate ranges for both hyperparameters. This may require a few attempts. To make things quicker when trying to find appropriate hyperparameter ranges, you can start by using only 2 folds. </w:t>
+        <w:t>Choose</w:t>
+      </w:r>
+      <w:proofErr w:type="gramEnd"/>
+      <w:r>
+        <w:rPr>
+          <w:rFonts w:asciiTheme="minorBidi" w:hAnsiTheme="minorBidi"/>
+        </w:rPr>
+        <w:t xml:space="preserve"> appropriate ranges for both hyperparameters. This may require a few attempts. To make things quicker when trying to find appropriate hyperparameter ranges, you can start by using only 2 folds. </w:t>
       </w:r>
     </w:p>
     <w:p>
@@ -1023,6 +1138,160 @@
         </w:rPr>
         <w:t>Our ranges:</w:t>
       </w:r>
+    </w:p>
+    <w:p>
+      <w:pPr>
+        <w:pStyle w:val="ListParagraph"/>
+        <w:numPr>
+          <w:ilvl w:val="0"/>
+          <w:numId w:val="4"/>
+        </w:numPr>
+        <w:rPr>
+          <w:rFonts w:asciiTheme="minorBidi" w:hAnsiTheme="minorBidi"/>
+          <w:color w:val="156082" w:themeColor="accent1"/>
+        </w:rPr>
+      </w:pPr>
+      <w:r>
+        <w:rPr>
+          <w:rFonts w:asciiTheme="minorBidi" w:hAnsiTheme="minorBidi"/>
+          <w:color w:val="156082" w:themeColor="accent1"/>
+        </w:rPr>
+        <w:t>“</w:t>
+      </w:r>
+      <w:proofErr w:type="spellStart"/>
+      <w:r>
+        <w:rPr>
+          <w:rFonts w:asciiTheme="minorBidi" w:hAnsiTheme="minorBidi"/>
+          <w:color w:val="156082" w:themeColor="accent1"/>
+        </w:rPr>
+        <w:t>max_depth</w:t>
+      </w:r>
+      <w:proofErr w:type="spellEnd"/>
+      <w:r>
+        <w:rPr>
+          <w:rFonts w:asciiTheme="minorBidi" w:hAnsiTheme="minorBidi"/>
+          <w:color w:val="156082" w:themeColor="accent1"/>
+        </w:rPr>
+        <w:t>”</w:t>
+      </w:r>
+      <w:r>
+        <w:rPr>
+          <w:rFonts w:asciiTheme="minorBidi" w:hAnsiTheme="minorBidi"/>
+          <w:color w:val="156082" w:themeColor="accent1"/>
+        </w:rPr>
+        <w:t xml:space="preserve"> range </w:t>
+      </w:r>
+      <w:proofErr w:type="gramStart"/>
+      <w:r>
+        <w:rPr>
+          <w:rFonts w:asciiTheme="minorBidi" w:hAnsiTheme="minorBidi"/>
+          <w:color w:val="156082" w:themeColor="accent1"/>
+        </w:rPr>
+        <w:t xml:space="preserve">=  </w:t>
+      </w:r>
+      <w:r>
+        <w:rPr>
+          <w:rFonts w:asciiTheme="minorBidi" w:hAnsiTheme="minorBidi"/>
+          <w:color w:val="156082" w:themeColor="accent1"/>
+        </w:rPr>
+        <w:t>[</w:t>
+      </w:r>
+      <w:proofErr w:type="gramEnd"/>
+      <w:r>
+        <w:rPr>
+          <w:rFonts w:asciiTheme="minorBidi" w:hAnsiTheme="minorBidi"/>
+          <w:color w:val="156082" w:themeColor="accent1"/>
+        </w:rPr>
+        <w:t xml:space="preserve"> 5,  6,  7,  8,  9, 10, 11, 12, 13, 14, 15, 16, 17, 18, 19, 20, 21,</w:t>
+      </w:r>
+      <w:r>
+        <w:rPr>
+          <w:rFonts w:asciiTheme="minorBidi" w:hAnsiTheme="minorBidi"/>
+          <w:color w:val="156082" w:themeColor="accent1"/>
+        </w:rPr>
+        <w:t xml:space="preserve"> </w:t>
+      </w:r>
+      <w:r>
+        <w:rPr>
+          <w:rFonts w:asciiTheme="minorBidi" w:hAnsiTheme="minorBidi"/>
+          <w:color w:val="156082" w:themeColor="accent1"/>
+        </w:rPr>
+        <w:t>22, 23, 24, 25, 26, 27, 28, 29]</w:t>
+      </w:r>
+    </w:p>
+    <w:p>
+      <w:pPr>
+        <w:pStyle w:val="ListParagraph"/>
+        <w:numPr>
+          <w:ilvl w:val="0"/>
+          <w:numId w:val="4"/>
+        </w:numPr>
+        <w:rPr>
+          <w:rFonts w:asciiTheme="minorBidi" w:hAnsiTheme="minorBidi"/>
+          <w:color w:val="156082" w:themeColor="accent1"/>
+        </w:rPr>
+      </w:pPr>
+      <w:r>
+        <w:rPr>
+          <w:rFonts w:asciiTheme="minorBidi" w:hAnsiTheme="minorBidi"/>
+          <w:color w:val="156082" w:themeColor="accent1"/>
+        </w:rPr>
+        <w:t>“</w:t>
+      </w:r>
+      <w:proofErr w:type="spellStart"/>
+      <w:r>
+        <w:rPr>
+          <w:rFonts w:asciiTheme="minorBidi" w:hAnsiTheme="minorBidi"/>
+          <w:color w:val="156082" w:themeColor="accent1"/>
+        </w:rPr>
+        <w:t>min_samples_leaf</w:t>
+      </w:r>
+      <w:proofErr w:type="spellEnd"/>
+      <w:r>
+        <w:rPr>
+          <w:rFonts w:asciiTheme="minorBidi" w:hAnsiTheme="minorBidi"/>
+          <w:color w:val="156082" w:themeColor="accent1"/>
+        </w:rPr>
+        <w:t xml:space="preserve"> </w:t>
+      </w:r>
+      <w:proofErr w:type="gramStart"/>
+      <w:r>
+        <w:rPr>
+          <w:rFonts w:asciiTheme="minorBidi" w:hAnsiTheme="minorBidi"/>
+          <w:color w:val="156082" w:themeColor="accent1"/>
+        </w:rPr>
+        <w:t>“ range</w:t>
+      </w:r>
+      <w:proofErr w:type="gramEnd"/>
+      <w:r>
+        <w:rPr>
+          <w:rFonts w:asciiTheme="minorBidi" w:hAnsiTheme="minorBidi"/>
+          <w:color w:val="156082" w:themeColor="accent1"/>
+        </w:rPr>
+        <w:t xml:space="preserve">: </w:t>
+      </w:r>
+      <w:r>
+        <w:rPr>
+          <w:rFonts w:asciiTheme="minorBidi" w:hAnsiTheme="minorBidi"/>
+          <w:color w:val="156082" w:themeColor="accent1"/>
+        </w:rPr>
+        <w:t>[</w:t>
+      </w:r>
+      <w:r>
+        <w:rPr>
+          <w:rFonts w:asciiTheme="minorBidi" w:hAnsiTheme="minorBidi"/>
+          <w:color w:val="156082" w:themeColor="accent1"/>
+        </w:rPr>
+        <w:t>1,  3,  5,  7,  9, 11, 13]</w:t>
+      </w:r>
+    </w:p>
+    <w:p>
+      <w:pPr>
+        <w:rPr>
+          <w:rFonts w:asciiTheme="minorBidi" w:hAnsiTheme="minorBidi"/>
+          <w:color w:val="156082" w:themeColor="accent1"/>
+        </w:rPr>
+      </w:pPr>
       <w:r>
         <w:rPr>
           <w:rFonts w:asciiTheme="minorBidi" w:hAnsiTheme="minorBidi"/>
@@ -1040,74 +1309,828 @@
       <w:r>
         <w:rPr>
           <w:rFonts w:asciiTheme="minorBidi" w:hAnsiTheme="minorBidi"/>
-        </w:rPr>
-        <w:t xml:space="preserve">b. Since we tune two hyperparameters, instead of a validation curve, plot two heatmaps (seaborn / pyplot), for each of the cross-validated training and validation accuracy (the heatmaps should roughly look like the ones to the right). Plot the appropriate “ticks” on both axes and use annotations (annot=True) to explicitly write accuracies inside heatmap cells. Important: The plots should be readable and informative! </w:t>
-      </w:r>
-    </w:p>
-    <w:p>
-      <w:pPr>
-        <w:rPr>
-          <w:rFonts w:asciiTheme="minorBidi" w:hAnsiTheme="minorBidi"/>
-        </w:rPr>
-      </w:pPr>
-    </w:p>
-    <w:p>
-      <w:pPr>
-        <w:rPr>
-          <w:rFonts w:asciiTheme="minorBidi" w:hAnsiTheme="minorBidi"/>
-        </w:rPr>
-      </w:pPr>
-      <w:r>
-        <w:rPr>
-          <w:rFonts w:asciiTheme="minorBidi" w:hAnsiTheme="minorBidi"/>
-        </w:rPr>
-        <w:t xml:space="preserve">c. Add the 2 plots to your report and specify which hyperparameter combination is optimal. </w:t>
-      </w:r>
-    </w:p>
-    <w:p>
-      <w:pPr>
-        <w:rPr>
-          <w:rFonts w:asciiTheme="minorBidi" w:hAnsiTheme="minorBidi"/>
-        </w:rPr>
-      </w:pPr>
-    </w:p>
-    <w:p>
-      <w:pPr>
-        <w:rPr>
-          <w:rFonts w:asciiTheme="minorBidi" w:hAnsiTheme="minorBidi"/>
-        </w:rPr>
-      </w:pPr>
-      <w:r>
-        <w:rPr>
-          <w:rFonts w:asciiTheme="minorBidi" w:hAnsiTheme="minorBidi"/>
-        </w:rPr>
-        <w:t xml:space="preserve">d. Write a hyperparameter-combination that causes underfitting. </w:t>
-      </w:r>
-    </w:p>
-    <w:p>
-      <w:pPr>
-        <w:rPr>
-          <w:rFonts w:asciiTheme="minorBidi" w:hAnsiTheme="minorBidi"/>
-        </w:rPr>
-      </w:pPr>
-    </w:p>
-    <w:p>
-      <w:pPr>
-        <w:rPr>
-          <w:rFonts w:asciiTheme="minorBidi" w:hAnsiTheme="minorBidi"/>
-        </w:rPr>
-      </w:pPr>
-      <w:r>
-        <w:rPr>
-          <w:rFonts w:asciiTheme="minorBidi" w:hAnsiTheme="minorBidi"/>
-        </w:rPr>
-        <w:t xml:space="preserve">e. Write a hyperparameter-combination that causes overfitting. </w:t>
-      </w:r>
-    </w:p>
-    <w:p>
-      <w:pPr>
-        <w:rPr>
-          <w:rFonts w:asciiTheme="minorBidi" w:hAnsiTheme="minorBidi"/>
+          <w:b/>
+          <w:bCs/>
+        </w:rPr>
+        <w:t>b.</w:t>
+      </w:r>
+      <w:r>
+        <w:rPr>
+          <w:rFonts w:asciiTheme="minorBidi" w:hAnsiTheme="minorBidi"/>
+        </w:rPr>
+        <w:t xml:space="preserve"> Since we tune two hyperparameters, instead of a validation curve, plot two heatmaps (seaborn / pyplot), for each of the cross-validated training and validation accuracy (the heatmaps should roughly look like the ones to the right). Plot the appropriate “ticks” on both axes and use annotations (annot=True) to explicitly write accuracies inside heatmap cells. Important: The plots should be readable and informative! </w:t>
+      </w:r>
+    </w:p>
+    <w:p>
+      <w:pPr>
+        <w:rPr>
+          <w:rFonts w:asciiTheme="minorBidi" w:hAnsiTheme="minorBidi"/>
+        </w:rPr>
+      </w:pPr>
+      <w:r>
+        <w:rPr>
+          <w:rFonts w:asciiTheme="minorBidi" w:hAnsiTheme="minorBidi"/>
+          <w:b/>
+          <w:bCs/>
+        </w:rPr>
+        <w:t>c.</w:t>
+      </w:r>
+      <w:r>
+        <w:rPr>
+          <w:rFonts w:asciiTheme="minorBidi" w:hAnsiTheme="minorBidi"/>
+        </w:rPr>
+        <w:t xml:space="preserve"> Add the 2 plots to your report and specify which hyperparameter combination is optimal. </w:t>
+      </w:r>
+    </w:p>
+    <w:p>
+      <w:pPr>
+        <w:rPr>
+          <w:rFonts w:asciiTheme="minorBidi" w:hAnsiTheme="minorBidi"/>
+          <w:color w:val="0070C0"/>
+        </w:rPr>
+      </w:pPr>
+      <w:r>
+        <w:rPr>
+          <w:rFonts w:asciiTheme="minorBidi" w:hAnsiTheme="minorBidi"/>
+          <w:color w:val="0070C0"/>
+        </w:rPr>
+        <w:t>The heat maps:</w:t>
+      </w:r>
+    </w:p>
+    <w:p>
+      <w:pPr>
+        <w:rPr>
+          <w:rFonts w:asciiTheme="minorBidi" w:hAnsiTheme="minorBidi"/>
+          <w:color w:val="0070C0"/>
+        </w:rPr>
+      </w:pPr>
+      <w:r>
+        <w:rPr>
+          <w:rFonts w:asciiTheme="minorBidi" w:hAnsiTheme="minorBidi"/>
+          <w:color w:val="0070C0"/>
+        </w:rPr>
+        <w:drawing>
+          <wp:inline distT="0" distB="0" distL="0" distR="0" wp14:anchorId="3F56A90D" wp14:editId="3C3F4E05">
+            <wp:extent cx="3435350" cy="2834898"/>
+            <wp:effectExtent l="0" t="0" r="0" b="3810"/>
+            <wp:docPr id="1766299194" name="Picture 1" descr="A screenshot of a graph&#10;&#10;Description automatically generated"/>
+            <wp:cNvGraphicFramePr>
+              <a:graphicFrameLocks xmlns:a="http://schemas.openxmlformats.org/drawingml/2006/main" noChangeAspect="1"/>
+            </wp:cNvGraphicFramePr>
+            <a:graphic xmlns:a="http://schemas.openxmlformats.org/drawingml/2006/main">
+              <a:graphicData uri="http://schemas.openxmlformats.org/drawingml/2006/picture">
+                <pic:pic xmlns:pic="http://schemas.openxmlformats.org/drawingml/2006/picture">
+                  <pic:nvPicPr>
+                    <pic:cNvPr id="1766299194" name="Picture 1" descr="A screenshot of a graph&#10;&#10;Description automatically generated"/>
+                    <pic:cNvPicPr/>
+                  </pic:nvPicPr>
+                  <pic:blipFill>
+                    <a:blip r:embed="rId11"/>
+                    <a:stretch>
+                      <a:fillRect/>
+                    </a:stretch>
+                  </pic:blipFill>
+                  <pic:spPr>
+                    <a:xfrm>
+                      <a:off x="0" y="0"/>
+                      <a:ext cx="3441988" cy="2840375"/>
+                    </a:xfrm>
+                    <a:prstGeom prst="rect">
+                      <a:avLst/>
+                    </a:prstGeom>
+                  </pic:spPr>
+                </pic:pic>
+              </a:graphicData>
+            </a:graphic>
+          </wp:inline>
+        </w:drawing>
+      </w:r>
+    </w:p>
+    <w:p>
+      <w:pPr>
+        <w:rPr>
+          <w:rFonts w:asciiTheme="minorBidi" w:hAnsiTheme="minorBidi"/>
+          <w:color w:val="0070C0"/>
+        </w:rPr>
+      </w:pPr>
+      <w:r>
+        <w:rPr>
+          <w:rFonts w:asciiTheme="minorBidi" w:hAnsiTheme="minorBidi"/>
+          <w:color w:val="0070C0"/>
+        </w:rPr>
+        <w:lastRenderedPageBreak/>
+        <w:drawing>
+          <wp:inline distT="0" distB="0" distL="0" distR="0" wp14:anchorId="6A166196" wp14:editId="736402E0">
+            <wp:extent cx="3429000" cy="2961908"/>
+            <wp:effectExtent l="0" t="0" r="0" b="0"/>
+            <wp:docPr id="133023492" name="Picture 1"/>
+            <wp:cNvGraphicFramePr>
+              <a:graphicFrameLocks xmlns:a="http://schemas.openxmlformats.org/drawingml/2006/main" noChangeAspect="1"/>
+            </wp:cNvGraphicFramePr>
+            <a:graphic xmlns:a="http://schemas.openxmlformats.org/drawingml/2006/main">
+              <a:graphicData uri="http://schemas.openxmlformats.org/drawingml/2006/picture">
+                <pic:pic xmlns:pic="http://schemas.openxmlformats.org/drawingml/2006/picture">
+                  <pic:nvPicPr>
+                    <pic:cNvPr id="133023492" name=""/>
+                    <pic:cNvPicPr/>
+                  </pic:nvPicPr>
+                  <pic:blipFill>
+                    <a:blip r:embed="rId12"/>
+                    <a:stretch>
+                      <a:fillRect/>
+                    </a:stretch>
+                  </pic:blipFill>
+                  <pic:spPr>
+                    <a:xfrm>
+                      <a:off x="0" y="0"/>
+                      <a:ext cx="3436636" cy="2968504"/>
+                    </a:xfrm>
+                    <a:prstGeom prst="rect">
+                      <a:avLst/>
+                    </a:prstGeom>
+                  </pic:spPr>
+                </pic:pic>
+              </a:graphicData>
+            </a:graphic>
+          </wp:inline>
+        </w:drawing>
+      </w:r>
+    </w:p>
+    <w:p>
+      <w:pPr>
+        <w:rPr>
+          <w:rFonts w:asciiTheme="minorBidi" w:hAnsiTheme="minorBidi"/>
+          <w:color w:val="0070C0"/>
+        </w:rPr>
+      </w:pPr>
+    </w:p>
+    <w:p>
+      <w:pPr>
+        <w:rPr>
+          <w:rFonts w:asciiTheme="minorBidi" w:hAnsiTheme="minorBidi"/>
+          <w:color w:val="0070C0"/>
+        </w:rPr>
+      </w:pPr>
+      <w:r>
+        <w:rPr>
+          <w:rFonts w:asciiTheme="minorBidi" w:hAnsiTheme="minorBidi"/>
+          <w:color w:val="0070C0"/>
+        </w:rPr>
+        <w:t>The optimal hyper parameters are:</w:t>
+      </w:r>
+    </w:p>
+    <w:p>
+      <w:pPr>
+        <w:rPr>
+          <w:rFonts w:asciiTheme="minorBidi" w:hAnsiTheme="minorBidi"/>
+          <w:color w:val="0070C0"/>
+          <w:lang w:val="en-IL"/>
+        </w:rPr>
+      </w:pPr>
+      <w:r>
+        <w:rPr>
+          <w:rFonts w:asciiTheme="minorBidi" w:hAnsiTheme="minorBidi"/>
+          <w:color w:val="0070C0"/>
+          <w:lang w:val="en-IL"/>
+        </w:rPr>
+        <w:t>'</w:t>
+      </w:r>
+      <w:proofErr w:type="spellStart"/>
+      <w:proofErr w:type="gramStart"/>
+      <w:r>
+        <w:rPr>
+          <w:rFonts w:asciiTheme="minorBidi" w:hAnsiTheme="minorBidi"/>
+          <w:color w:val="0070C0"/>
+          <w:lang w:val="en-IL"/>
+        </w:rPr>
+        <w:t>max</w:t>
+      </w:r>
+      <w:proofErr w:type="gramEnd"/>
+      <w:r>
+        <w:rPr>
+          <w:rFonts w:asciiTheme="minorBidi" w:hAnsiTheme="minorBidi"/>
+          <w:color w:val="0070C0"/>
+          <w:lang w:val="en-IL"/>
+        </w:rPr>
+        <w:t>_depth</w:t>
+      </w:r>
+      <w:proofErr w:type="spellEnd"/>
+      <w:r>
+        <w:rPr>
+          <w:rFonts w:asciiTheme="minorBidi" w:hAnsiTheme="minorBidi"/>
+          <w:color w:val="0070C0"/>
+          <w:lang w:val="en-IL"/>
+        </w:rPr>
+        <w:t>': 1</w:t>
+      </w:r>
+      <w:r>
+        <w:rPr>
+          <w:rFonts w:asciiTheme="minorBidi" w:hAnsiTheme="minorBidi"/>
+          <w:color w:val="0070C0"/>
+          <w:lang w:val="en-IL"/>
+        </w:rPr>
+        <w:t>1</w:t>
+      </w:r>
+    </w:p>
+    <w:p>
+      <w:pPr>
+        <w:rPr>
+          <w:rFonts w:asciiTheme="minorBidi" w:hAnsiTheme="minorBidi"/>
+          <w:color w:val="0070C0"/>
+          <w:lang w:val="en-IL"/>
+        </w:rPr>
+      </w:pPr>
+      <w:r>
+        <w:rPr>
+          <w:rFonts w:asciiTheme="minorBidi" w:hAnsiTheme="minorBidi"/>
+          <w:color w:val="0070C0"/>
+          <w:lang w:val="en-IL"/>
+        </w:rPr>
+        <w:t>'</w:t>
+      </w:r>
+      <w:proofErr w:type="spellStart"/>
+      <w:proofErr w:type="gramStart"/>
+      <w:r>
+        <w:rPr>
+          <w:rFonts w:asciiTheme="minorBidi" w:hAnsiTheme="minorBidi"/>
+          <w:color w:val="0070C0"/>
+          <w:lang w:val="en-IL"/>
+        </w:rPr>
+        <w:t>min</w:t>
+      </w:r>
+      <w:proofErr w:type="gramEnd"/>
+      <w:r>
+        <w:rPr>
+          <w:rFonts w:asciiTheme="minorBidi" w:hAnsiTheme="minorBidi"/>
+          <w:color w:val="0070C0"/>
+          <w:lang w:val="en-IL"/>
+        </w:rPr>
+        <w:t>_samples_leaf</w:t>
+      </w:r>
+      <w:proofErr w:type="spellEnd"/>
+      <w:r>
+        <w:rPr>
+          <w:rFonts w:asciiTheme="minorBidi" w:hAnsiTheme="minorBidi"/>
+          <w:color w:val="0070C0"/>
+          <w:lang w:val="en-IL"/>
+        </w:rPr>
+        <w:t xml:space="preserve">': </w:t>
+      </w:r>
+      <w:r>
+        <w:rPr>
+          <w:rFonts w:asciiTheme="minorBidi" w:hAnsiTheme="minorBidi"/>
+          <w:color w:val="0070C0"/>
+          <w:lang w:val="en-IL"/>
+        </w:rPr>
+        <w:t>9</w:t>
+      </w:r>
+    </w:p>
+    <w:p>
+      <w:pPr>
+        <w:rPr>
+          <w:rFonts w:asciiTheme="minorBidi" w:hAnsiTheme="minorBidi"/>
+          <w:color w:val="0070C0"/>
+          <w:lang w:val="en-IL"/>
+        </w:rPr>
+      </w:pPr>
+      <w:r>
+        <w:rPr>
+          <w:rFonts w:asciiTheme="minorBidi" w:hAnsiTheme="minorBidi"/>
+          <w:color w:val="0070C0"/>
+          <w:lang w:val="en-IL"/>
+        </w:rPr>
+        <w:t xml:space="preserve">Yielding </w:t>
+      </w:r>
+      <w:r>
+        <w:rPr>
+          <w:rFonts w:asciiTheme="minorBidi" w:hAnsiTheme="minorBidi"/>
+          <w:color w:val="0070C0"/>
+          <w:lang w:val="en-IL"/>
+        </w:rPr>
+        <w:t>88.3</w:t>
+      </w:r>
+      <w:r>
+        <w:rPr>
+          <w:rFonts w:asciiTheme="minorBidi" w:hAnsiTheme="minorBidi"/>
+          <w:color w:val="0070C0"/>
+          <w:lang w:val="en-IL"/>
+        </w:rPr>
+        <w:t>% training and 8</w:t>
+      </w:r>
+      <w:r>
+        <w:rPr>
+          <w:rFonts w:asciiTheme="minorBidi" w:hAnsiTheme="minorBidi"/>
+          <w:color w:val="0070C0"/>
+          <w:lang w:val="en-IL"/>
+        </w:rPr>
+        <w:t>3</w:t>
+      </w:r>
+      <w:r>
+        <w:rPr>
+          <w:rFonts w:asciiTheme="minorBidi" w:hAnsiTheme="minorBidi"/>
+          <w:color w:val="0070C0"/>
+          <w:lang w:val="en-IL"/>
+        </w:rPr>
+        <w:t>.</w:t>
+      </w:r>
+      <w:r>
+        <w:rPr>
+          <w:rFonts w:asciiTheme="minorBidi" w:hAnsiTheme="minorBidi"/>
+          <w:color w:val="0070C0"/>
+          <w:lang w:val="en-IL"/>
+        </w:rPr>
+        <w:t>1</w:t>
+      </w:r>
+      <w:r>
+        <w:rPr>
+          <w:rFonts w:asciiTheme="minorBidi" w:hAnsiTheme="minorBidi"/>
+          <w:color w:val="0070C0"/>
+          <w:lang w:val="en-IL"/>
+        </w:rPr>
+        <w:t xml:space="preserve">% validation </w:t>
+      </w:r>
+      <w:r>
+        <w:rPr>
+          <w:rFonts w:asciiTheme="minorBidi" w:hAnsiTheme="minorBidi"/>
+          <w:color w:val="0070C0"/>
+          <w:lang w:val="en-IL"/>
+        </w:rPr>
+        <w:t xml:space="preserve">mean </w:t>
+      </w:r>
+      <w:r>
+        <w:rPr>
+          <w:rFonts w:asciiTheme="minorBidi" w:hAnsiTheme="minorBidi"/>
+          <w:color w:val="0070C0"/>
+          <w:lang w:val="en-IL"/>
+        </w:rPr>
+        <w:t>accuracy.</w:t>
+      </w:r>
+    </w:p>
+    <w:p>
+      <w:pPr>
+        <w:rPr>
+          <w:rFonts w:asciiTheme="minorBidi" w:hAnsiTheme="minorBidi"/>
+        </w:rPr>
+      </w:pPr>
+    </w:p>
+    <w:p>
+      <w:pPr>
+        <w:rPr>
+          <w:rFonts w:asciiTheme="minorBidi" w:hAnsiTheme="minorBidi"/>
+        </w:rPr>
+      </w:pPr>
+      <w:r>
+        <w:rPr>
+          <w:rFonts w:asciiTheme="minorBidi" w:hAnsiTheme="minorBidi"/>
+          <w:b/>
+          <w:bCs/>
+        </w:rPr>
+        <w:t>d.</w:t>
+      </w:r>
+      <w:r>
+        <w:rPr>
+          <w:rFonts w:asciiTheme="minorBidi" w:hAnsiTheme="minorBidi"/>
+        </w:rPr>
+        <w:t xml:space="preserve"> Write a hyperparameter-combination that causes underfitting. </w:t>
+      </w:r>
+    </w:p>
+    <w:p>
+      <w:pPr>
+        <w:rPr>
+          <w:rFonts w:asciiTheme="minorBidi" w:hAnsiTheme="minorBidi"/>
+          <w:color w:val="0070C0"/>
+        </w:rPr>
+      </w:pPr>
+      <w:r>
+        <w:rPr>
+          <w:rFonts w:asciiTheme="minorBidi" w:hAnsiTheme="minorBidi"/>
+          <w:color w:val="0070C0"/>
+        </w:rPr>
+        <w:t>Answer:</w:t>
+      </w:r>
+      <w:r>
+        <w:rPr>
+          <w:rFonts w:asciiTheme="minorBidi" w:hAnsiTheme="minorBidi"/>
+          <w:color w:val="0070C0"/>
+        </w:rPr>
+        <w:t xml:space="preserve"> consider </w:t>
+      </w:r>
+    </w:p>
+    <w:p>
+      <w:pPr>
+        <w:rPr>
+          <w:rFonts w:asciiTheme="minorBidi" w:hAnsiTheme="minorBidi"/>
+          <w:color w:val="0070C0"/>
+          <w:lang w:val="en-IL"/>
+        </w:rPr>
+      </w:pPr>
+      <w:r>
+        <w:rPr>
+          <w:rFonts w:asciiTheme="minorBidi" w:hAnsiTheme="minorBidi"/>
+          <w:color w:val="0070C0"/>
+          <w:lang w:val="en-IL"/>
+        </w:rPr>
+        <w:t>'</w:t>
+      </w:r>
+      <w:proofErr w:type="spellStart"/>
+      <w:proofErr w:type="gramStart"/>
+      <w:r>
+        <w:rPr>
+          <w:rFonts w:asciiTheme="minorBidi" w:hAnsiTheme="minorBidi"/>
+          <w:color w:val="0070C0"/>
+          <w:lang w:val="en-IL"/>
+        </w:rPr>
+        <w:t>max</w:t>
+      </w:r>
+      <w:proofErr w:type="gramEnd"/>
+      <w:r>
+        <w:rPr>
+          <w:rFonts w:asciiTheme="minorBidi" w:hAnsiTheme="minorBidi"/>
+          <w:color w:val="0070C0"/>
+          <w:lang w:val="en-IL"/>
+        </w:rPr>
+        <w:t>_depth</w:t>
+      </w:r>
+      <w:proofErr w:type="spellEnd"/>
+      <w:r>
+        <w:rPr>
+          <w:rFonts w:asciiTheme="minorBidi" w:hAnsiTheme="minorBidi"/>
+          <w:color w:val="0070C0"/>
+          <w:lang w:val="en-IL"/>
+        </w:rPr>
+        <w:t xml:space="preserve">': </w:t>
+      </w:r>
+      <w:r>
+        <w:rPr>
+          <w:rFonts w:asciiTheme="minorBidi" w:hAnsiTheme="minorBidi"/>
+          <w:color w:val="0070C0"/>
+          <w:lang w:val="en-IL"/>
+        </w:rPr>
+        <w:t>5</w:t>
+      </w:r>
+      <w:r>
+        <w:rPr>
+          <w:rFonts w:asciiTheme="minorBidi" w:hAnsiTheme="minorBidi"/>
+          <w:color w:val="0070C0"/>
+          <w:lang w:val="en-IL"/>
+        </w:rPr>
+        <w:t xml:space="preserve"> </w:t>
+      </w:r>
+    </w:p>
+    <w:p>
+      <w:pPr>
+        <w:rPr>
+          <w:rFonts w:asciiTheme="minorBidi" w:hAnsiTheme="minorBidi"/>
+          <w:color w:val="0070C0"/>
+          <w:lang w:val="en-IL"/>
+        </w:rPr>
+      </w:pPr>
+      <w:r>
+        <w:rPr>
+          <w:rFonts w:asciiTheme="minorBidi" w:hAnsiTheme="minorBidi"/>
+          <w:color w:val="0070C0"/>
+          <w:lang w:val="en-IL"/>
+        </w:rPr>
+        <w:t>'</w:t>
+      </w:r>
+      <w:proofErr w:type="spellStart"/>
+      <w:proofErr w:type="gramStart"/>
+      <w:r>
+        <w:rPr>
+          <w:rFonts w:asciiTheme="minorBidi" w:hAnsiTheme="minorBidi"/>
+          <w:color w:val="0070C0"/>
+          <w:lang w:val="en-IL"/>
+        </w:rPr>
+        <w:t>min</w:t>
+      </w:r>
+      <w:proofErr w:type="gramEnd"/>
+      <w:r>
+        <w:rPr>
+          <w:rFonts w:asciiTheme="minorBidi" w:hAnsiTheme="minorBidi"/>
+          <w:color w:val="0070C0"/>
+          <w:lang w:val="en-IL"/>
+        </w:rPr>
+        <w:t>_samples_leaf</w:t>
+      </w:r>
+      <w:proofErr w:type="spellEnd"/>
+      <w:r>
+        <w:rPr>
+          <w:rFonts w:asciiTheme="minorBidi" w:hAnsiTheme="minorBidi"/>
+          <w:color w:val="0070C0"/>
+          <w:lang w:val="en-IL"/>
+        </w:rPr>
+        <w:t xml:space="preserve">': </w:t>
+      </w:r>
+      <w:r>
+        <w:rPr>
+          <w:rFonts w:asciiTheme="minorBidi" w:hAnsiTheme="minorBidi"/>
+          <w:color w:val="0070C0"/>
+          <w:lang w:val="en-IL"/>
+        </w:rPr>
+        <w:t>13</w:t>
+      </w:r>
+    </w:p>
+    <w:p>
+      <w:pPr>
+        <w:rPr>
+          <w:rFonts w:asciiTheme="minorBidi" w:hAnsiTheme="minorBidi"/>
+          <w:color w:val="0070C0"/>
+          <w:lang w:val="en-IL"/>
+        </w:rPr>
+      </w:pPr>
+      <w:r>
+        <w:rPr>
+          <w:rFonts w:asciiTheme="minorBidi" w:hAnsiTheme="minorBidi"/>
+          <w:color w:val="0070C0"/>
+          <w:lang w:val="en-IL"/>
+        </w:rPr>
+        <w:t xml:space="preserve">Yielding </w:t>
+      </w:r>
+      <w:r>
+        <w:rPr>
+          <w:rFonts w:asciiTheme="minorBidi" w:hAnsiTheme="minorBidi"/>
+          <w:color w:val="0070C0"/>
+          <w:lang w:val="en-IL"/>
+        </w:rPr>
+        <w:t>73.</w:t>
+      </w:r>
+      <w:r>
+        <w:rPr>
+          <w:rFonts w:asciiTheme="minorBidi" w:hAnsiTheme="minorBidi"/>
+          <w:color w:val="0070C0"/>
+          <w:lang w:val="en-IL"/>
+        </w:rPr>
+        <w:t>0</w:t>
+      </w:r>
+      <w:r>
+        <w:rPr>
+          <w:rFonts w:asciiTheme="minorBidi" w:hAnsiTheme="minorBidi"/>
+          <w:color w:val="0070C0"/>
+          <w:lang w:val="en-IL"/>
+        </w:rPr>
+        <w:t xml:space="preserve">% training and </w:t>
+      </w:r>
+      <w:r>
+        <w:rPr>
+          <w:rFonts w:asciiTheme="minorBidi" w:hAnsiTheme="minorBidi"/>
+          <w:color w:val="0070C0"/>
+          <w:lang w:val="en-IL"/>
+        </w:rPr>
+        <w:t>72.5</w:t>
+      </w:r>
+      <w:r>
+        <w:rPr>
+          <w:rFonts w:asciiTheme="minorBidi" w:hAnsiTheme="minorBidi"/>
+          <w:color w:val="0070C0"/>
+          <w:lang w:val="en-IL"/>
+        </w:rPr>
+        <w:t>% validation</w:t>
+      </w:r>
+      <w:r>
+        <w:rPr>
+          <w:rFonts w:asciiTheme="minorBidi" w:hAnsiTheme="minorBidi"/>
+          <w:color w:val="0070C0"/>
+          <w:lang w:val="en-IL"/>
+        </w:rPr>
+        <w:t xml:space="preserve"> mean </w:t>
+      </w:r>
+      <w:r>
+        <w:rPr>
+          <w:rFonts w:asciiTheme="minorBidi" w:hAnsiTheme="minorBidi"/>
+          <w:color w:val="0070C0"/>
+          <w:lang w:val="en-IL"/>
+        </w:rPr>
+        <w:t>accuracy.</w:t>
+      </w:r>
+    </w:p>
+    <w:p>
+      <w:pPr>
+        <w:rPr>
+          <w:rFonts w:asciiTheme="minorBidi" w:hAnsiTheme="minorBidi"/>
+          <w:color w:val="0070C0"/>
+          <w:lang w:val="en-IL"/>
+        </w:rPr>
+      </w:pPr>
+    </w:p>
+    <w:p>
+      <w:pPr>
+        <w:rPr>
+          <w:rFonts w:asciiTheme="minorBidi" w:hAnsiTheme="minorBidi"/>
+        </w:rPr>
+      </w:pPr>
+      <w:r>
+        <w:rPr>
+          <w:rFonts w:asciiTheme="minorBidi" w:hAnsiTheme="minorBidi"/>
+          <w:b/>
+          <w:bCs/>
+        </w:rPr>
+        <w:t>e.</w:t>
+      </w:r>
+      <w:r>
+        <w:rPr>
+          <w:rFonts w:asciiTheme="minorBidi" w:hAnsiTheme="minorBidi"/>
+        </w:rPr>
+        <w:t xml:space="preserve"> Write a hyperparameter-combination that causes overfitting. </w:t>
+      </w:r>
+    </w:p>
+    <w:p>
+      <w:pPr>
+        <w:rPr>
+          <w:rFonts w:asciiTheme="minorBidi" w:hAnsiTheme="minorBidi"/>
+          <w:color w:val="0070C0"/>
+        </w:rPr>
+      </w:pPr>
+      <w:r>
+        <w:rPr>
+          <w:rFonts w:asciiTheme="minorBidi" w:hAnsiTheme="minorBidi"/>
+          <w:color w:val="0070C0"/>
+        </w:rPr>
+        <w:t>Answer:</w:t>
+      </w:r>
+      <w:r>
+        <w:rPr>
+          <w:rFonts w:asciiTheme="minorBidi" w:hAnsiTheme="minorBidi"/>
+          <w:color w:val="0070C0"/>
+        </w:rPr>
+        <w:t xml:space="preserve"> consider </w:t>
+      </w:r>
+    </w:p>
+    <w:p>
+      <w:pPr>
+        <w:rPr>
+          <w:rFonts w:asciiTheme="minorBidi" w:hAnsiTheme="minorBidi"/>
+          <w:color w:val="0070C0"/>
+          <w:lang w:val="en-IL"/>
+        </w:rPr>
+      </w:pPr>
+      <w:r>
+        <w:rPr>
+          <w:rFonts w:asciiTheme="minorBidi" w:hAnsiTheme="minorBidi"/>
+          <w:color w:val="0070C0"/>
+          <w:lang w:val="en-IL"/>
+        </w:rPr>
+        <w:t>'</w:t>
+      </w:r>
+      <w:proofErr w:type="spellStart"/>
+      <w:proofErr w:type="gramStart"/>
+      <w:r>
+        <w:rPr>
+          <w:rFonts w:asciiTheme="minorBidi" w:hAnsiTheme="minorBidi"/>
+          <w:color w:val="0070C0"/>
+          <w:lang w:val="en-IL"/>
+        </w:rPr>
+        <w:t>max</w:t>
+      </w:r>
+      <w:proofErr w:type="gramEnd"/>
+      <w:r>
+        <w:rPr>
+          <w:rFonts w:asciiTheme="minorBidi" w:hAnsiTheme="minorBidi"/>
+          <w:color w:val="0070C0"/>
+          <w:lang w:val="en-IL"/>
+        </w:rPr>
+        <w:t>_depth</w:t>
+      </w:r>
+      <w:proofErr w:type="spellEnd"/>
+      <w:r>
+        <w:rPr>
+          <w:rFonts w:asciiTheme="minorBidi" w:hAnsiTheme="minorBidi"/>
+          <w:color w:val="0070C0"/>
+          <w:lang w:val="en-IL"/>
+        </w:rPr>
+        <w:t xml:space="preserve">': </w:t>
+      </w:r>
+      <w:r>
+        <w:rPr>
+          <w:rFonts w:asciiTheme="minorBidi" w:hAnsiTheme="minorBidi"/>
+          <w:color w:val="0070C0"/>
+          <w:lang w:val="en-IL"/>
+        </w:rPr>
+        <w:t>18</w:t>
+      </w:r>
+      <w:r>
+        <w:rPr>
+          <w:rFonts w:asciiTheme="minorBidi" w:hAnsiTheme="minorBidi"/>
+          <w:color w:val="0070C0"/>
+          <w:lang w:val="en-IL"/>
+        </w:rPr>
+        <w:t xml:space="preserve"> </w:t>
+      </w:r>
+    </w:p>
+    <w:p>
+      <w:pPr>
+        <w:rPr>
+          <w:rFonts w:asciiTheme="minorBidi" w:hAnsiTheme="minorBidi"/>
+          <w:color w:val="0070C0"/>
+          <w:lang w:val="en-IL"/>
+        </w:rPr>
+      </w:pPr>
+      <w:r>
+        <w:rPr>
+          <w:rFonts w:asciiTheme="minorBidi" w:hAnsiTheme="minorBidi"/>
+          <w:color w:val="0070C0"/>
+          <w:lang w:val="en-IL"/>
+        </w:rPr>
+        <w:t>'</w:t>
+      </w:r>
+      <w:proofErr w:type="spellStart"/>
+      <w:proofErr w:type="gramStart"/>
+      <w:r>
+        <w:rPr>
+          <w:rFonts w:asciiTheme="minorBidi" w:hAnsiTheme="minorBidi"/>
+          <w:color w:val="0070C0"/>
+          <w:lang w:val="en-IL"/>
+        </w:rPr>
+        <w:t>min</w:t>
+      </w:r>
+      <w:proofErr w:type="gramEnd"/>
+      <w:r>
+        <w:rPr>
+          <w:rFonts w:asciiTheme="minorBidi" w:hAnsiTheme="minorBidi"/>
+          <w:color w:val="0070C0"/>
+          <w:lang w:val="en-IL"/>
+        </w:rPr>
+        <w:t>_samples_leaf</w:t>
+      </w:r>
+      <w:proofErr w:type="spellEnd"/>
+      <w:r>
+        <w:rPr>
+          <w:rFonts w:asciiTheme="minorBidi" w:hAnsiTheme="minorBidi"/>
+          <w:color w:val="0070C0"/>
+          <w:lang w:val="en-IL"/>
+        </w:rPr>
+        <w:t xml:space="preserve">': </w:t>
+      </w:r>
+      <w:r>
+        <w:rPr>
+          <w:rFonts w:asciiTheme="minorBidi" w:hAnsiTheme="minorBidi"/>
+          <w:color w:val="0070C0"/>
+          <w:lang w:val="en-IL"/>
+        </w:rPr>
+        <w:t>1</w:t>
+      </w:r>
+    </w:p>
+    <w:p>
+      <w:pPr>
+        <w:rPr>
+          <w:rFonts w:asciiTheme="minorBidi" w:hAnsiTheme="minorBidi"/>
+          <w:color w:val="0070C0"/>
+          <w:lang w:val="en-IL"/>
+        </w:rPr>
+      </w:pPr>
+      <w:r>
+        <w:rPr>
+          <w:rFonts w:asciiTheme="minorBidi" w:hAnsiTheme="minorBidi"/>
+          <w:color w:val="0070C0"/>
+          <w:lang w:val="en-IL"/>
+        </w:rPr>
+        <w:t xml:space="preserve">Yielding </w:t>
+      </w:r>
+      <w:r>
+        <w:rPr>
+          <w:rFonts w:asciiTheme="minorBidi" w:hAnsiTheme="minorBidi"/>
+          <w:color w:val="0070C0"/>
+          <w:lang w:val="en-IL"/>
+        </w:rPr>
+        <w:t>100.0</w:t>
+      </w:r>
+      <w:r>
+        <w:rPr>
+          <w:rFonts w:asciiTheme="minorBidi" w:hAnsiTheme="minorBidi"/>
+          <w:color w:val="0070C0"/>
+          <w:lang w:val="en-IL"/>
+        </w:rPr>
+        <w:t>% training and 7</w:t>
+      </w:r>
+      <w:r>
+        <w:rPr>
+          <w:rFonts w:asciiTheme="minorBidi" w:hAnsiTheme="minorBidi"/>
+          <w:color w:val="0070C0"/>
+          <w:lang w:val="en-IL"/>
+        </w:rPr>
+        <w:t>9</w:t>
+      </w:r>
+      <w:r>
+        <w:rPr>
+          <w:rFonts w:asciiTheme="minorBidi" w:hAnsiTheme="minorBidi"/>
+          <w:color w:val="0070C0"/>
+          <w:lang w:val="en-IL"/>
+        </w:rPr>
+        <w:t>.3% validation mean accuracy.</w:t>
+      </w:r>
+    </w:p>
+    <w:p>
+      <w:pPr>
+        <w:rPr>
+          <w:rFonts w:asciiTheme="minorBidi" w:hAnsiTheme="minorBidi"/>
+          <w:lang w:val="en-IL"/>
+        </w:rPr>
+      </w:pPr>
+    </w:p>
+    <w:p>
+      <w:pPr>
+        <w:rPr>
+          <w:rFonts w:asciiTheme="minorBidi" w:hAnsiTheme="minorBidi"/>
+          <w:lang w:val="en-IL"/>
         </w:rPr>
       </w:pPr>
     </w:p>
@@ -1123,6 +2146,7 @@
         <w:rPr>
           <w:rFonts w:asciiTheme="minorBidi" w:hAnsiTheme="minorBidi"/>
         </w:rPr>
+        <w:lastRenderedPageBreak/>
         <w:t>f. Add a short discussion regarding why each specific hyperparameter-combination from sub-questions 'd' and 'e' resulted in under/over-fitting.</w:t>
       </w:r>
     </w:p>
@@ -1130,30 +2154,610 @@
       <w:pPr>
         <w:rPr>
           <w:rFonts w:asciiTheme="minorBidi" w:hAnsiTheme="minorBidi"/>
-          <w:lang w:val="en-US"/>
-        </w:rPr>
-      </w:pPr>
-    </w:p>
-    <w:p>
-      <w:pPr>
-        <w:rPr>
-          <w:rFonts w:asciiTheme="minorBidi" w:hAnsiTheme="minorBidi"/>
-          <w:lang w:val="en-US"/>
-        </w:rPr>
-      </w:pPr>
-    </w:p>
-    <w:p>
-      <w:pPr>
-        <w:rPr>
-          <w:rFonts w:asciiTheme="minorBidi" w:hAnsiTheme="minorBidi"/>
-          <w:lang w:val="en-US"/>
-        </w:rPr>
-      </w:pPr>
-    </w:p>
-    <w:p>
-      <w:pPr>
-        <w:rPr>
-          <w:rFonts w:asciiTheme="minorBidi" w:hAnsiTheme="minorBidi"/>
+          <w:color w:val="0070C0"/>
+          <w:lang w:val="en-US"/>
+        </w:rPr>
+      </w:pPr>
+      <w:r>
+        <w:rPr>
+          <w:rFonts w:asciiTheme="minorBidi" w:hAnsiTheme="minorBidi"/>
+          <w:color w:val="0070C0"/>
+          <w:lang w:val="en-US"/>
+        </w:rPr>
+        <w:t>Answer:</w:t>
+      </w:r>
+    </w:p>
+    <w:p>
+      <w:pPr>
+        <w:pStyle w:val="ListParagraph"/>
+        <w:numPr>
+          <w:ilvl w:val="0"/>
+          <w:numId w:val="4"/>
+        </w:numPr>
+        <w:rPr>
+          <w:rFonts w:asciiTheme="minorBidi" w:hAnsiTheme="minorBidi"/>
+          <w:color w:val="0070C0"/>
+          <w:lang w:val="en-US"/>
+        </w:rPr>
+      </w:pPr>
+      <w:r>
+        <w:rPr>
+          <w:rFonts w:asciiTheme="minorBidi" w:hAnsiTheme="minorBidi"/>
+          <w:color w:val="0070C0"/>
+          <w:lang w:val="en-US"/>
+        </w:rPr>
+        <w:t>Underfitting example: (d)</w:t>
+      </w:r>
+    </w:p>
+    <w:p>
+      <w:pPr>
+        <w:pStyle w:val="ListParagraph"/>
+        <w:numPr>
+          <w:ilvl w:val="0"/>
+          <w:numId w:val="5"/>
+        </w:numPr>
+        <w:rPr>
+          <w:rFonts w:asciiTheme="minorBidi" w:hAnsiTheme="minorBidi"/>
+          <w:color w:val="0070C0"/>
+          <w:lang w:val="en-US"/>
+        </w:rPr>
+      </w:pPr>
+      <w:r>
+        <w:rPr>
+          <w:rFonts w:asciiTheme="minorBidi" w:hAnsiTheme="minorBidi"/>
+          <w:color w:val="0070C0"/>
+          <w:lang w:val="en-US"/>
+        </w:rPr>
+        <w:t>Low depth restricts the model to a low number of separation regions.</w:t>
+      </w:r>
+    </w:p>
+    <w:p>
+      <w:pPr>
+        <w:pStyle w:val="ListParagraph"/>
+        <w:numPr>
+          <w:ilvl w:val="0"/>
+          <w:numId w:val="5"/>
+        </w:numPr>
+        <w:rPr>
+          <w:rFonts w:asciiTheme="minorBidi" w:hAnsiTheme="minorBidi"/>
+          <w:color w:val="0070C0"/>
+          <w:lang w:val="en-US"/>
+        </w:rPr>
+      </w:pPr>
+      <w:r>
+        <w:rPr>
+          <w:rFonts w:asciiTheme="minorBidi" w:hAnsiTheme="minorBidi"/>
+          <w:color w:val="0070C0"/>
+          <w:lang w:val="en-US"/>
+        </w:rPr>
+        <w:t xml:space="preserve">High </w:t>
+      </w:r>
+      <w:proofErr w:type="spellStart"/>
+      <w:r>
+        <w:rPr>
+          <w:rFonts w:asciiTheme="minorBidi" w:hAnsiTheme="minorBidi"/>
+          <w:color w:val="0070C0"/>
+          <w:lang w:val="en-US"/>
+        </w:rPr>
+        <w:t>min_samples_leaf</w:t>
+      </w:r>
+      <w:proofErr w:type="spellEnd"/>
+      <w:r>
+        <w:rPr>
+          <w:rFonts w:asciiTheme="minorBidi" w:hAnsiTheme="minorBidi"/>
+          <w:color w:val="0070C0"/>
+          <w:lang w:val="en-US"/>
+        </w:rPr>
+        <w:t xml:space="preserve"> leads to the model trying to generalize too much.</w:t>
+      </w:r>
+    </w:p>
+    <w:p>
+      <w:pPr>
+        <w:ind w:left="720"/>
+        <w:rPr>
+          <w:rFonts w:asciiTheme="minorBidi" w:hAnsiTheme="minorBidi"/>
+          <w:color w:val="0070C0"/>
+          <w:lang w:val="en-US"/>
+        </w:rPr>
+      </w:pPr>
+      <w:r>
+        <w:rPr>
+          <w:rFonts w:asciiTheme="minorBidi" w:hAnsiTheme="minorBidi"/>
+          <w:color w:val="0070C0"/>
+          <w:lang w:val="en-US"/>
+        </w:rPr>
+        <w:t xml:space="preserve">Both </w:t>
+      </w:r>
+      <w:r>
+        <w:rPr>
+          <w:rFonts w:asciiTheme="minorBidi" w:hAnsiTheme="minorBidi"/>
+          <w:color w:val="0070C0"/>
+          <w:lang w:val="en-US"/>
+        </w:rPr>
+        <w:t>result in underfi</w:t>
+      </w:r>
+      <w:r>
+        <w:rPr>
+          <w:rFonts w:asciiTheme="minorBidi" w:hAnsiTheme="minorBidi"/>
+          <w:color w:val="0070C0"/>
+          <w:lang w:val="en-US"/>
+        </w:rPr>
+        <w:t>tting.</w:t>
+      </w:r>
+    </w:p>
+    <w:p>
+      <w:pPr>
+        <w:pStyle w:val="ListParagraph"/>
+        <w:numPr>
+          <w:ilvl w:val="0"/>
+          <w:numId w:val="4"/>
+        </w:numPr>
+        <w:rPr>
+          <w:rFonts w:asciiTheme="minorBidi" w:hAnsiTheme="minorBidi"/>
+          <w:color w:val="0070C0"/>
+          <w:lang w:val="en-US"/>
+        </w:rPr>
+      </w:pPr>
+      <w:r>
+        <w:rPr>
+          <w:rFonts w:asciiTheme="minorBidi" w:hAnsiTheme="minorBidi"/>
+          <w:color w:val="0070C0"/>
+          <w:lang w:val="en-US"/>
+        </w:rPr>
+        <w:t>Overfitting example: (e)</w:t>
+      </w:r>
+    </w:p>
+    <w:p>
+      <w:pPr>
+        <w:pStyle w:val="ListParagraph"/>
+        <w:numPr>
+          <w:ilvl w:val="0"/>
+          <w:numId w:val="5"/>
+        </w:numPr>
+        <w:rPr>
+          <w:rFonts w:asciiTheme="minorBidi" w:hAnsiTheme="minorBidi"/>
+          <w:color w:val="0070C0"/>
+          <w:lang w:val="en-US"/>
+        </w:rPr>
+      </w:pPr>
+      <w:r>
+        <w:rPr>
+          <w:rFonts w:asciiTheme="minorBidi" w:hAnsiTheme="minorBidi"/>
+          <w:color w:val="0070C0"/>
+          <w:lang w:val="en-US"/>
+        </w:rPr>
+        <w:t>High depth gives the model a too high ability to separate the datasets to many regions.</w:t>
+      </w:r>
+    </w:p>
+    <w:p>
+      <w:pPr>
+        <w:pStyle w:val="ListParagraph"/>
+        <w:numPr>
+          <w:ilvl w:val="0"/>
+          <w:numId w:val="5"/>
+        </w:numPr>
+        <w:rPr>
+          <w:rFonts w:asciiTheme="minorBidi" w:hAnsiTheme="minorBidi"/>
+          <w:color w:val="0070C0"/>
+          <w:lang w:val="en-US"/>
+        </w:rPr>
+      </w:pPr>
+      <w:r>
+        <w:rPr>
+          <w:rFonts w:asciiTheme="minorBidi" w:hAnsiTheme="minorBidi"/>
+          <w:color w:val="0070C0"/>
+          <w:lang w:val="en-US"/>
+        </w:rPr>
+        <w:t xml:space="preserve">Low </w:t>
+      </w:r>
+      <w:proofErr w:type="spellStart"/>
+      <w:r>
+        <w:rPr>
+          <w:rFonts w:asciiTheme="minorBidi" w:hAnsiTheme="minorBidi"/>
+          <w:color w:val="0070C0"/>
+          <w:lang w:val="en-US"/>
+        </w:rPr>
+        <w:t>min_sample_leafs</w:t>
+      </w:r>
+      <w:proofErr w:type="spellEnd"/>
+      <w:r>
+        <w:rPr>
+          <w:rFonts w:asciiTheme="minorBidi" w:hAnsiTheme="minorBidi"/>
+          <w:color w:val="0070C0"/>
+          <w:lang w:val="en-US"/>
+        </w:rPr>
+        <w:t xml:space="preserve"> </w:t>
+      </w:r>
+      <w:proofErr w:type="gramStart"/>
+      <w:r>
+        <w:rPr>
+          <w:rFonts w:asciiTheme="minorBidi" w:hAnsiTheme="minorBidi"/>
+          <w:color w:val="0070C0"/>
+          <w:lang w:val="en-US"/>
+        </w:rPr>
+        <w:t>leads</w:t>
+      </w:r>
+      <w:proofErr w:type="gramEnd"/>
+      <w:r>
+        <w:rPr>
+          <w:rFonts w:asciiTheme="minorBidi" w:hAnsiTheme="minorBidi"/>
+          <w:color w:val="0070C0"/>
+          <w:lang w:val="en-US"/>
+        </w:rPr>
+        <w:t xml:space="preserve"> to the model not trying to generalize much (here </w:t>
+      </w:r>
+      <w:proofErr w:type="spellStart"/>
+      <w:r>
+        <w:rPr>
+          <w:rFonts w:asciiTheme="minorBidi" w:hAnsiTheme="minorBidi"/>
+          <w:color w:val="0070C0"/>
+          <w:lang w:val="en-US"/>
+        </w:rPr>
+        <w:t>min_sample_leafs</w:t>
+      </w:r>
+      <w:proofErr w:type="spellEnd"/>
+      <w:r>
+        <w:rPr>
+          <w:rFonts w:asciiTheme="minorBidi" w:hAnsiTheme="minorBidi"/>
+          <w:color w:val="0070C0"/>
+          <w:lang w:val="en-US"/>
+        </w:rPr>
+        <w:t xml:space="preserve"> == 1, meaning almost no generalization </w:t>
+      </w:r>
+      <w:r>
+        <w:rPr>
+          <w:rFonts w:asciiTheme="minorBidi" w:hAnsiTheme="minorBidi"/>
+          <w:color w:val="0070C0"/>
+          <w:lang w:val="en-US"/>
+        </w:rPr>
+        <w:t>in this example</w:t>
+      </w:r>
+      <w:r>
+        <w:rPr>
+          <w:rFonts w:asciiTheme="minorBidi" w:hAnsiTheme="minorBidi"/>
+          <w:color w:val="0070C0"/>
+          <w:lang w:val="en-US"/>
+        </w:rPr>
+        <w:t>)</w:t>
+      </w:r>
+    </w:p>
+    <w:p>
+      <w:pPr>
+        <w:ind w:left="720"/>
+        <w:rPr>
+          <w:rFonts w:asciiTheme="minorBidi" w:hAnsiTheme="minorBidi"/>
+          <w:color w:val="0070C0"/>
+          <w:lang w:val="en-US"/>
+        </w:rPr>
+      </w:pPr>
+      <w:r>
+        <w:rPr>
+          <w:rFonts w:asciiTheme="minorBidi" w:hAnsiTheme="minorBidi"/>
+          <w:color w:val="0070C0"/>
+          <w:lang w:val="en-US"/>
+        </w:rPr>
+        <w:t xml:space="preserve">Both result in </w:t>
+      </w:r>
+      <w:r>
+        <w:rPr>
+          <w:rFonts w:asciiTheme="minorBidi" w:hAnsiTheme="minorBidi"/>
+          <w:color w:val="0070C0"/>
+          <w:lang w:val="en-US"/>
+        </w:rPr>
+        <w:t>over</w:t>
+      </w:r>
+      <w:r>
+        <w:rPr>
+          <w:rFonts w:asciiTheme="minorBidi" w:hAnsiTheme="minorBidi"/>
+          <w:color w:val="0070C0"/>
+          <w:lang w:val="en-US"/>
+        </w:rPr>
+        <w:t>fitting.</w:t>
+      </w:r>
+    </w:p>
+    <w:p>
+      <w:pPr>
+        <w:rPr>
+          <w:rFonts w:asciiTheme="minorBidi" w:hAnsiTheme="minorBidi"/>
+          <w:color w:val="0070C0"/>
+          <w:lang w:val="en-US"/>
+        </w:rPr>
+      </w:pPr>
+    </w:p>
+    <w:p>
+      <w:pPr>
+        <w:autoSpaceDE w:val="0"/>
+        <w:autoSpaceDN w:val="0"/>
+        <w:adjustRightInd w:val="0"/>
+        <w:spacing w:after="0" w:line="240" w:lineRule="auto"/>
+        <w:rPr>
+          <w:rFonts w:asciiTheme="minorBidi" w:eastAsia="ArialMT" w:hAnsiTheme="minorBidi"/>
+          <w:kern w:val="0"/>
+          <w:lang w:val="en-IL" w:bidi="ar-SA"/>
+        </w:rPr>
+      </w:pPr>
+      <w:r>
+        <w:rPr>
+          <w:rFonts w:asciiTheme="minorBidi" w:hAnsiTheme="minorBidi"/>
+          <w:b/>
+          <w:bCs/>
+          <w:kern w:val="0"/>
+          <w:lang w:val="en-IL" w:bidi="ar-SA"/>
+        </w:rPr>
+        <w:t xml:space="preserve">Q7) </w:t>
+      </w:r>
+      <w:r>
+        <w:rPr>
+          <w:rFonts w:asciiTheme="minorBidi" w:eastAsia="ArialMT" w:hAnsiTheme="minorBidi"/>
+          <w:kern w:val="0"/>
+          <w:lang w:val="en-IL" w:bidi="ar-SA"/>
+        </w:rPr>
+        <w:t>Write the number of hyperparameter combinations that were evaluated in your grid</w:t>
+      </w:r>
+    </w:p>
+    <w:p>
+      <w:pPr>
+        <w:autoSpaceDE w:val="0"/>
+        <w:autoSpaceDN w:val="0"/>
+        <w:adjustRightInd w:val="0"/>
+        <w:spacing w:after="0" w:line="240" w:lineRule="auto"/>
+        <w:rPr>
+          <w:rFonts w:asciiTheme="minorBidi" w:eastAsia="ArialMT" w:hAnsiTheme="minorBidi"/>
+          <w:kern w:val="0"/>
+          <w:lang w:val="en-IL" w:bidi="ar-SA"/>
+        </w:rPr>
+      </w:pPr>
+      <w:r>
+        <w:rPr>
+          <w:rFonts w:asciiTheme="minorBidi" w:eastAsia="ArialMT" w:hAnsiTheme="minorBidi"/>
+          <w:kern w:val="0"/>
+          <w:lang w:val="en-IL" w:bidi="ar-SA"/>
+        </w:rPr>
+        <w:t>search. Had you wished to tune a third hyperparameter, how would that affect the</w:t>
+      </w:r>
+    </w:p>
+    <w:p>
+      <w:pPr>
+        <w:autoSpaceDE w:val="0"/>
+        <w:autoSpaceDN w:val="0"/>
+        <w:adjustRightInd w:val="0"/>
+        <w:spacing w:after="0" w:line="240" w:lineRule="auto"/>
+        <w:rPr>
+          <w:rFonts w:asciiTheme="minorBidi" w:eastAsia="ArialMT" w:hAnsiTheme="minorBidi"/>
+          <w:kern w:val="0"/>
+          <w:lang w:val="en-IL" w:bidi="ar-SA"/>
+        </w:rPr>
+      </w:pPr>
+      <w:r>
+        <w:rPr>
+          <w:rFonts w:asciiTheme="minorBidi" w:eastAsia="ArialMT" w:hAnsiTheme="minorBidi"/>
+          <w:kern w:val="0"/>
+          <w:lang w:val="en-IL" w:bidi="ar-SA"/>
+        </w:rPr>
+        <w:t>number of combinations? Shortly discuss how searching over additional</w:t>
+      </w:r>
+    </w:p>
+    <w:p>
+      <w:pPr>
+        <w:rPr>
+          <w:rFonts w:asciiTheme="minorBidi" w:eastAsia="ArialMT" w:hAnsiTheme="minorBidi"/>
+          <w:kern w:val="0"/>
+          <w:lang w:val="en-IL" w:bidi="ar-SA"/>
+        </w:rPr>
+      </w:pPr>
+      <w:r>
+        <w:rPr>
+          <w:rFonts w:asciiTheme="minorBidi" w:eastAsia="ArialMT" w:hAnsiTheme="minorBidi"/>
+          <w:kern w:val="0"/>
+          <w:lang w:val="en-IL" w:bidi="ar-SA"/>
+        </w:rPr>
+        <w:t>hyperparameters affects the total number of possible combinations.</w:t>
+      </w:r>
+    </w:p>
+    <w:p>
+      <w:pPr>
+        <w:rPr>
+          <w:rFonts w:asciiTheme="minorBidi" w:eastAsia="ArialMT" w:hAnsiTheme="minorBidi"/>
+          <w:color w:val="0070C0"/>
+          <w:kern w:val="0"/>
+          <w:lang w:val="en-IL" w:bidi="ar-SA"/>
+        </w:rPr>
+      </w:pPr>
+      <w:r>
+        <w:rPr>
+          <w:rFonts w:asciiTheme="minorBidi" w:eastAsia="ArialMT" w:hAnsiTheme="minorBidi"/>
+          <w:color w:val="0070C0"/>
+          <w:kern w:val="0"/>
+          <w:lang w:val="en-IL" w:bidi="ar-SA"/>
+        </w:rPr>
+        <w:t>Answer:</w:t>
+      </w:r>
+    </w:p>
+    <w:p>
+      <w:pPr>
+        <w:rPr>
+          <w:rFonts w:asciiTheme="minorBidi" w:hAnsiTheme="minorBidi"/>
+          <w:lang w:val="en-US"/>
+        </w:rPr>
+      </w:pPr>
+      <w:r>
+        <w:rPr>
+          <w:rFonts w:asciiTheme="minorBidi" w:hAnsiTheme="minorBidi"/>
+          <w:lang w:val="en-US"/>
+        </w:rPr>
+        <w:drawing>
+          <wp:inline distT="0" distB="0" distL="0" distR="0" wp14:anchorId="7ED18EF8" wp14:editId="4866B19C">
+            <wp:extent cx="4515480" cy="219106"/>
+            <wp:effectExtent l="0" t="0" r="0" b="9525"/>
+            <wp:docPr id="2075452575" name="Picture 1"/>
+            <wp:cNvGraphicFramePr>
+              <a:graphicFrameLocks xmlns:a="http://schemas.openxmlformats.org/drawingml/2006/main" noChangeAspect="1"/>
+            </wp:cNvGraphicFramePr>
+            <a:graphic xmlns:a="http://schemas.openxmlformats.org/drawingml/2006/main">
+              <a:graphicData uri="http://schemas.openxmlformats.org/drawingml/2006/picture">
+                <pic:pic xmlns:pic="http://schemas.openxmlformats.org/drawingml/2006/picture">
+                  <pic:nvPicPr>
+                    <pic:cNvPr id="2075452575" name=""/>
+                    <pic:cNvPicPr/>
+                  </pic:nvPicPr>
+                  <pic:blipFill>
+                    <a:blip r:embed="rId13"/>
+                    <a:stretch>
+                      <a:fillRect/>
+                    </a:stretch>
+                  </pic:blipFill>
+                  <pic:spPr>
+                    <a:xfrm>
+                      <a:off x="0" y="0"/>
+                      <a:ext cx="4515480" cy="219106"/>
+                    </a:xfrm>
+                    <a:prstGeom prst="rect">
+                      <a:avLst/>
+                    </a:prstGeom>
+                  </pic:spPr>
+                </pic:pic>
+              </a:graphicData>
+            </a:graphic>
+          </wp:inline>
+        </w:drawing>
+      </w:r>
+    </w:p>
+    <w:p>
+      <w:pPr>
+        <w:rPr>
+          <w:rFonts w:asciiTheme="minorBidi" w:hAnsiTheme="minorBidi"/>
+          <w:color w:val="0070C0"/>
+          <w:lang w:val="en-US"/>
+        </w:rPr>
+      </w:pPr>
+      <w:r>
+        <w:rPr>
+          <w:rFonts w:asciiTheme="minorBidi" w:hAnsiTheme="minorBidi"/>
+          <w:color w:val="0070C0"/>
+          <w:lang w:val="en-US"/>
+        </w:rPr>
+        <w:t xml:space="preserve">Given </w:t>
+      </w:r>
+      <w:r>
+        <w:rPr>
+          <w:rFonts w:asciiTheme="minorBidi" w:hAnsiTheme="minorBidi"/>
+          <w:color w:val="0070C0"/>
+          <w:lang w:val="en-US"/>
+        </w:rPr>
+        <w:t>a</w:t>
+      </w:r>
+      <w:r>
+        <w:rPr>
+          <w:rFonts w:asciiTheme="minorBidi" w:hAnsiTheme="minorBidi"/>
+          <w:color w:val="0070C0"/>
+          <w:lang w:val="en-US"/>
+        </w:rPr>
+        <w:t xml:space="preserve"> third param with a grid range of size k, will have a total of 175*k candidates and 875*k fits</w:t>
+      </w:r>
+      <w:r>
+        <w:rPr>
+          <w:rFonts w:asciiTheme="minorBidi" w:hAnsiTheme="minorBidi"/>
+          <w:color w:val="0070C0"/>
+          <w:lang w:val="en-US"/>
+        </w:rPr>
+        <w:t>.</w:t>
+      </w:r>
+    </w:p>
+    <w:p>
+      <w:pPr>
+        <w:rPr>
+          <w:rFonts w:asciiTheme="minorBidi" w:hAnsiTheme="minorBidi"/>
+          <w:color w:val="0070C0"/>
+          <w:lang w:val="en-US"/>
+        </w:rPr>
+      </w:pPr>
+    </w:p>
+    <w:p>
+      <w:pPr>
+        <w:rPr>
+          <w:rFonts w:asciiTheme="minorBidi" w:hAnsiTheme="minorBidi"/>
+          <w:lang w:val="en-US"/>
+        </w:rPr>
+      </w:pPr>
+      <w:r>
+        <w:rPr>
+          <w:rFonts w:asciiTheme="minorBidi" w:hAnsiTheme="minorBidi"/>
+          <w:b/>
+          <w:bCs/>
+          <w:lang w:val="en-US"/>
+        </w:rPr>
+        <w:t>(Q8)</w:t>
+      </w:r>
+      <w:r>
+        <w:rPr>
+          <w:rFonts w:asciiTheme="minorBidi" w:hAnsiTheme="minorBidi"/>
+          <w:lang w:val="en-US"/>
+        </w:rPr>
+        <w:t xml:space="preserve"> Use the optimal hyperparameter combination you found and retrain a decision tree on</w:t>
+      </w:r>
+      <w:r>
+        <w:rPr>
+          <w:rFonts w:asciiTheme="minorBidi" w:hAnsiTheme="minorBidi"/>
+          <w:lang w:val="en-US"/>
+        </w:rPr>
+        <w:t xml:space="preserve"> </w:t>
+      </w:r>
+      <w:r>
+        <w:rPr>
+          <w:rFonts w:asciiTheme="minorBidi" w:hAnsiTheme="minorBidi"/>
+          <w:lang w:val="en-US"/>
+        </w:rPr>
+        <w:t>all the training samples. In your report write the test accuracy of this model.</w:t>
+      </w:r>
+    </w:p>
+    <w:p>
+      <w:pPr>
+        <w:rPr>
+          <w:rFonts w:asciiTheme="minorBidi" w:hAnsiTheme="minorBidi"/>
+          <w:color w:val="0070C0"/>
+          <w:lang w:val="en-US"/>
+        </w:rPr>
+      </w:pPr>
+      <w:r>
+        <w:rPr>
+          <w:rFonts w:asciiTheme="minorBidi" w:hAnsiTheme="minorBidi"/>
+          <w:color w:val="0070C0"/>
+          <w:lang w:val="en-US"/>
+        </w:rPr>
+        <w:t>Answer:</w:t>
+      </w:r>
+      <w:r>
+        <w:rPr>
+          <w:rFonts w:asciiTheme="minorBidi" w:hAnsiTheme="minorBidi"/>
+          <w:color w:val="0070C0"/>
+          <w:lang w:val="en-US"/>
+        </w:rPr>
+        <w:t xml:space="preserve"> The models test accuracy 82.0%</w:t>
+      </w:r>
+    </w:p>
+    <w:p>
+      <w:pPr>
+        <w:rPr>
+          <w:rFonts w:asciiTheme="minorBidi" w:hAnsiTheme="minorBidi"/>
+          <w:color w:val="0070C0"/>
+          <w:lang w:val="en-US"/>
+        </w:rPr>
+      </w:pPr>
+    </w:p>
+    <w:p>
+      <w:pPr>
+        <w:rPr>
+          <w:rFonts w:asciiTheme="minorBidi" w:hAnsiTheme="minorBidi"/>
+          <w:color w:val="0070C0"/>
+          <w:lang w:val="en-US"/>
+        </w:rPr>
+      </w:pPr>
+    </w:p>
+    <w:p>
+      <w:pPr>
+        <w:rPr>
+          <w:rFonts w:asciiTheme="minorBidi" w:hAnsiTheme="minorBidi"/>
+          <w:color w:val="0070C0"/>
           <w:lang w:val="en-US"/>
         </w:rPr>
       </w:pPr>
@@ -1202,8 +2806,120 @@
 </file>
 
 <file path=word/numbering.xml><?xml version="1.0" encoding="utf-8"?>
-<w:numbering xmlns:wpc="http://schemas.microsoft.com/office/word/2010/wordprocessingCanvas" xmlns:cx="http://schemas.microsoft.com/office/drawing/2014/chartex" xmlns:cx1="http://schemas.microsoft.com/office/drawing/2015/9/8/chartex" xmlns:cx2="http://schemas.microsoft.com/office/drawing/2015/10/21/chartex" xmlns:cx3="http://schemas.microsoft.com/office/drawing/2016/5/9/chartex" xmlns:cx4="http://schemas.microsoft.com/office/drawing/2016/5/10/chartex" xmlns:cx5="http://schemas.microsoft.com/office/drawing/2016/5/11/chartex" xmlns:cx6="http://schemas.microsoft.com/office/drawing/2016/5/12/chartex" xmlns:cx7="http://schemas.microsoft.com/office/drawing/2016/5/13/chartex" xmlns:cx8="http://schemas.microsoft.com/office/drawing/2016/5/14/chartex" xmlns:mc="http://schemas.openxmlformats.org/markup-compatibility/2006" xmlns:aink="http://schemas.microsoft.com/office/drawing/2016/ink" xmlns:am3d="http://schemas.microsoft.com/office/drawing/2017/model3d" xmlns:o="urn:schemas-microsoft-com:office:office" xmlns:oel="http://schemas.microsoft.com/office/2019/extlst" xmlns:r="http://schemas.openxmlformats.org/officeDocument/2006/relationships" xmlns:m="http://schemas.openxmlformats.org/officeDocument/2006/math" xmlns:v="urn:schemas-microsoft-com:vml" xmlns:wp14="http://schemas.microsoft.com/office/word/2010/wordprocessingDrawing" xmlns:wp="http://schemas.openxmlformats.org/drawingml/2006/wordprocessingDrawing" xmlns:w10="urn:schemas-microsoft-com:office:word" xmlns:w="http://schemas.openxmlformats.org/wordprocessingml/2006/main" xmlns:w14="http://schemas.microsoft.com/office/word/2010/wordml" xmlns:w15="http://schemas.microsoft.com/office/word/2012/wordml" xmlns:w16cex="http://schemas.microsoft.com/office/word/2018/wordml/cex" xmlns:w16cid="http://schemas.microsoft.com/office/word/2016/wordml/cid" xmlns:w16="http://schemas.microsoft.com/office/word/2018/wordml" xmlns:w16sdtdh="http://schemas.microsoft.com/office/word/2020/wordml/sdtdatahash" xmlns:w16se="http://schemas.microsoft.com/office/word/2015/wordml/symex" xmlns:wpg="http://schemas.microsoft.com/office/word/2010/wordprocessingGroup" xmlns:wpi="http://schemas.microsoft.com/office/word/2010/wordprocessingInk" xmlns:wne="http://schemas.microsoft.com/office/word/2006/wordml" xmlns:wps="http://schemas.microsoft.com/office/word/2010/wordprocessingShape" mc:Ignorable="w14 w15 w16se w16cid w16 w16cex w16sdtdh wp14">
+<w:numbering xmlns:wpc="http://schemas.microsoft.com/office/word/2010/wordprocessingCanvas" xmlns:cx="http://schemas.microsoft.com/office/drawing/2014/chartex" xmlns:cx1="http://schemas.microsoft.com/office/drawing/2015/9/8/chartex" xmlns:cx2="http://schemas.microsoft.com/office/drawing/2015/10/21/chartex" xmlns:cx3="http://schemas.microsoft.com/office/drawing/2016/5/9/chartex" xmlns:cx4="http://schemas.microsoft.com/office/drawing/2016/5/10/chartex" xmlns:cx5="http://schemas.microsoft.com/office/drawing/2016/5/11/chartex" xmlns:cx6="http://schemas.microsoft.com/office/drawing/2016/5/12/chartex" xmlns:cx7="http://schemas.microsoft.com/office/drawing/2016/5/13/chartex" xmlns:cx8="http://schemas.microsoft.com/office/drawing/2016/5/14/chartex" xmlns:mc="http://schemas.openxmlformats.org/markup-compatibility/2006" xmlns:aink="http://schemas.microsoft.com/office/drawing/2016/ink" xmlns:am3d="http://schemas.microsoft.com/office/drawing/2017/model3d" xmlns:o="urn:schemas-microsoft-com:office:office" xmlns:oel="http://schemas.microsoft.com/office/2019/extlst" xmlns:r="http://schemas.openxmlformats.org/officeDocument/2006/relationships" xmlns:m="http://schemas.openxmlformats.org/officeDocument/2006/math" xmlns:v="urn:schemas-microsoft-com:vml" xmlns:wp14="http://schemas.microsoft.com/office/word/2010/wordprocessingDrawing" xmlns:wp="http://schemas.openxmlformats.org/drawingml/2006/wordprocessingDrawing" xmlns:w10="urn:schemas-microsoft-com:office:word" xmlns:w="http://schemas.openxmlformats.org/wordprocessingml/2006/main" xmlns:w14="http://schemas.microsoft.com/office/word/2010/wordml" xmlns:w15="http://schemas.microsoft.com/office/word/2012/wordml" xmlns:w16cex="http://schemas.microsoft.com/office/word/2018/wordml/cex" xmlns:w16cid="http://schemas.microsoft.com/office/word/2016/wordml/cid" xmlns:w16="http://schemas.microsoft.com/office/word/2018/wordml" xmlns:w16du="http://schemas.microsoft.com/office/word/2023/wordml/word16du" xmlns:w16sdtdh="http://schemas.microsoft.com/office/word/2020/wordml/sdtdatahash" xmlns:w16se="http://schemas.microsoft.com/office/word/2015/wordml/symex" xmlns:wpg="http://schemas.microsoft.com/office/word/2010/wordprocessingGroup" xmlns:wpi="http://schemas.microsoft.com/office/word/2010/wordprocessingInk" xmlns:wne="http://schemas.microsoft.com/office/word/2006/wordml" xmlns:wps="http://schemas.microsoft.com/office/word/2010/wordprocessingShape" mc:Ignorable="w14 w15 w16se w16cid w16 w16cex w16sdtdh w16du wp14">
   <w:abstractNum w:abstractNumId="0" w15:restartNumberingAfterBreak="0">
+    <w:nsid w:val="1FF121ED"/>
+    <w:multiLevelType w:val="hybridMultilevel"/>
+    <w:tmpl w:val="C6ECE794"/>
+    <w:lvl w:ilvl="0" w:tplc="C66A5A04">
+      <w:numFmt w:val="bullet"/>
+      <w:lvlText w:val="-"/>
+      <w:lvlJc w:val="left"/>
+      <w:pPr>
+        <w:ind w:left="720" w:hanging="360"/>
+      </w:pPr>
+      <w:rPr>
+        <w:rFonts w:ascii="Arial" w:eastAsiaTheme="minorHAnsi" w:hAnsi="Arial" w:cs="Arial" w:hint="default"/>
+      </w:rPr>
+    </w:lvl>
+    <w:lvl w:ilvl="1" w:tplc="20000003" w:tentative="1">
+      <w:start w:val="1"/>
+      <w:numFmt w:val="bullet"/>
+      <w:lvlText w:val="o"/>
+      <w:lvlJc w:val="left"/>
+      <w:pPr>
+        <w:ind w:left="1440" w:hanging="360"/>
+      </w:pPr>
+      <w:rPr>
+        <w:rFonts w:ascii="Courier New" w:hAnsi="Courier New" w:cs="Courier New" w:hint="default"/>
+      </w:rPr>
+    </w:lvl>
+    <w:lvl w:ilvl="2" w:tplc="20000005" w:tentative="1">
+      <w:start w:val="1"/>
+      <w:numFmt w:val="bullet"/>
+      <w:lvlText w:val=""/>
+      <w:lvlJc w:val="left"/>
+      <w:pPr>
+        <w:ind w:left="2160" w:hanging="360"/>
+      </w:pPr>
+      <w:rPr>
+        <w:rFonts w:ascii="Wingdings" w:hAnsi="Wingdings" w:hint="default"/>
+      </w:rPr>
+    </w:lvl>
+    <w:lvl w:ilvl="3" w:tplc="20000001" w:tentative="1">
+      <w:start w:val="1"/>
+      <w:numFmt w:val="bullet"/>
+      <w:lvlText w:val=""/>
+      <w:lvlJc w:val="left"/>
+      <w:pPr>
+        <w:ind w:left="2880" w:hanging="360"/>
+      </w:pPr>
+      <w:rPr>
+        <w:rFonts w:ascii="Symbol" w:hAnsi="Symbol" w:hint="default"/>
+      </w:rPr>
+    </w:lvl>
+    <w:lvl w:ilvl="4" w:tplc="20000003" w:tentative="1">
+      <w:start w:val="1"/>
+      <w:numFmt w:val="bullet"/>
+      <w:lvlText w:val="o"/>
+      <w:lvlJc w:val="left"/>
+      <w:pPr>
+        <w:ind w:left="3600" w:hanging="360"/>
+      </w:pPr>
+      <w:rPr>
+        <w:rFonts w:ascii="Courier New" w:hAnsi="Courier New" w:cs="Courier New" w:hint="default"/>
+      </w:rPr>
+    </w:lvl>
+    <w:lvl w:ilvl="5" w:tplc="20000005" w:tentative="1">
+      <w:start w:val="1"/>
+      <w:numFmt w:val="bullet"/>
+      <w:lvlText w:val=""/>
+      <w:lvlJc w:val="left"/>
+      <w:pPr>
+        <w:ind w:left="4320" w:hanging="360"/>
+      </w:pPr>
+      <w:rPr>
+        <w:rFonts w:ascii="Wingdings" w:hAnsi="Wingdings" w:hint="default"/>
+      </w:rPr>
+    </w:lvl>
+    <w:lvl w:ilvl="6" w:tplc="20000001" w:tentative="1">
+      <w:start w:val="1"/>
+      <w:numFmt w:val="bullet"/>
+      <w:lvlText w:val=""/>
+      <w:lvlJc w:val="left"/>
+      <w:pPr>
+        <w:ind w:left="5040" w:hanging="360"/>
+      </w:pPr>
+      <w:rPr>
+        <w:rFonts w:ascii="Symbol" w:hAnsi="Symbol" w:hint="default"/>
+      </w:rPr>
+    </w:lvl>
+    <w:lvl w:ilvl="7" w:tplc="20000003" w:tentative="1">
+      <w:start w:val="1"/>
+      <w:numFmt w:val="bullet"/>
+      <w:lvlText w:val="o"/>
+      <w:lvlJc w:val="left"/>
+      <w:pPr>
+        <w:ind w:left="5760" w:hanging="360"/>
+      </w:pPr>
+      <w:rPr>
+        <w:rFonts w:ascii="Courier New" w:hAnsi="Courier New" w:cs="Courier New" w:hint="default"/>
+      </w:rPr>
+    </w:lvl>
+    <w:lvl w:ilvl="8" w:tplc="20000005" w:tentative="1">
+      <w:start w:val="1"/>
+      <w:numFmt w:val="bullet"/>
+      <w:lvlText w:val=""/>
+      <w:lvlJc w:val="left"/>
+      <w:pPr>
+        <w:ind w:left="6480" w:hanging="360"/>
+      </w:pPr>
+      <w:rPr>
+        <w:rFonts w:ascii="Wingdings" w:hAnsi="Wingdings" w:hint="default"/>
+      </w:rPr>
+    </w:lvl>
+  </w:abstractNum>
+  <w:abstractNum w:abstractNumId="1" w15:restartNumberingAfterBreak="0">
     <w:nsid w:val="205474BF"/>
     <w:multiLevelType w:val="hybridMultilevel"/>
     <w:tmpl w:val="58CCFFDA"/>
@@ -1292,7 +3008,7 @@
       </w:pPr>
     </w:lvl>
   </w:abstractNum>
-  <w:abstractNum w:abstractNumId="1" w15:restartNumberingAfterBreak="0">
+  <w:abstractNum w:abstractNumId="2" w15:restartNumberingAfterBreak="0">
     <w:nsid w:val="2E9D7A0B"/>
     <w:multiLevelType w:val="hybridMultilevel"/>
     <w:tmpl w:val="E2823104"/>
@@ -1381,7 +3097,120 @@
       </w:pPr>
     </w:lvl>
   </w:abstractNum>
-  <w:abstractNum w:abstractNumId="2" w15:restartNumberingAfterBreak="0">
+  <w:abstractNum w:abstractNumId="3" w15:restartNumberingAfterBreak="0">
+    <w:nsid w:val="32B874D1"/>
+    <w:multiLevelType w:val="hybridMultilevel"/>
+    <w:tmpl w:val="C6D21796"/>
+    <w:lvl w:ilvl="0" w:tplc="8164737C">
+      <w:start w:val="4"/>
+      <w:numFmt w:val="bullet"/>
+      <w:lvlText w:val=""/>
+      <w:lvlJc w:val="left"/>
+      <w:pPr>
+        <w:ind w:left="1080" w:hanging="360"/>
+      </w:pPr>
+      <w:rPr>
+        <w:rFonts w:ascii="Symbol" w:eastAsiaTheme="minorHAnsi" w:hAnsi="Symbol" w:cstheme="minorBidi" w:hint="default"/>
+      </w:rPr>
+    </w:lvl>
+    <w:lvl w:ilvl="1" w:tplc="20000003" w:tentative="1">
+      <w:start w:val="1"/>
+      <w:numFmt w:val="bullet"/>
+      <w:lvlText w:val="o"/>
+      <w:lvlJc w:val="left"/>
+      <w:pPr>
+        <w:ind w:left="1800" w:hanging="360"/>
+      </w:pPr>
+      <w:rPr>
+        <w:rFonts w:ascii="Courier New" w:hAnsi="Courier New" w:cs="Courier New" w:hint="default"/>
+      </w:rPr>
+    </w:lvl>
+    <w:lvl w:ilvl="2" w:tplc="20000005" w:tentative="1">
+      <w:start w:val="1"/>
+      <w:numFmt w:val="bullet"/>
+      <w:lvlText w:val=""/>
+      <w:lvlJc w:val="left"/>
+      <w:pPr>
+        <w:ind w:left="2520" w:hanging="360"/>
+      </w:pPr>
+      <w:rPr>
+        <w:rFonts w:ascii="Wingdings" w:hAnsi="Wingdings" w:hint="default"/>
+      </w:rPr>
+    </w:lvl>
+    <w:lvl w:ilvl="3" w:tplc="20000001" w:tentative="1">
+      <w:start w:val="1"/>
+      <w:numFmt w:val="bullet"/>
+      <w:lvlText w:val=""/>
+      <w:lvlJc w:val="left"/>
+      <w:pPr>
+        <w:ind w:left="3240" w:hanging="360"/>
+      </w:pPr>
+      <w:rPr>
+        <w:rFonts w:ascii="Symbol" w:hAnsi="Symbol" w:hint="default"/>
+      </w:rPr>
+    </w:lvl>
+    <w:lvl w:ilvl="4" w:tplc="20000003" w:tentative="1">
+      <w:start w:val="1"/>
+      <w:numFmt w:val="bullet"/>
+      <w:lvlText w:val="o"/>
+      <w:lvlJc w:val="left"/>
+      <w:pPr>
+        <w:ind w:left="3960" w:hanging="360"/>
+      </w:pPr>
+      <w:rPr>
+        <w:rFonts w:ascii="Courier New" w:hAnsi="Courier New" w:cs="Courier New" w:hint="default"/>
+      </w:rPr>
+    </w:lvl>
+    <w:lvl w:ilvl="5" w:tplc="20000005" w:tentative="1">
+      <w:start w:val="1"/>
+      <w:numFmt w:val="bullet"/>
+      <w:lvlText w:val=""/>
+      <w:lvlJc w:val="left"/>
+      <w:pPr>
+        <w:ind w:left="4680" w:hanging="360"/>
+      </w:pPr>
+      <w:rPr>
+        <w:rFonts w:ascii="Wingdings" w:hAnsi="Wingdings" w:hint="default"/>
+      </w:rPr>
+    </w:lvl>
+    <w:lvl w:ilvl="6" w:tplc="20000001" w:tentative="1">
+      <w:start w:val="1"/>
+      <w:numFmt w:val="bullet"/>
+      <w:lvlText w:val=""/>
+      <w:lvlJc w:val="left"/>
+      <w:pPr>
+        <w:ind w:left="5400" w:hanging="360"/>
+      </w:pPr>
+      <w:rPr>
+        <w:rFonts w:ascii="Symbol" w:hAnsi="Symbol" w:hint="default"/>
+      </w:rPr>
+    </w:lvl>
+    <w:lvl w:ilvl="7" w:tplc="20000003" w:tentative="1">
+      <w:start w:val="1"/>
+      <w:numFmt w:val="bullet"/>
+      <w:lvlText w:val="o"/>
+      <w:lvlJc w:val="left"/>
+      <w:pPr>
+        <w:ind w:left="6120" w:hanging="360"/>
+      </w:pPr>
+      <w:rPr>
+        <w:rFonts w:ascii="Courier New" w:hAnsi="Courier New" w:cs="Courier New" w:hint="default"/>
+      </w:rPr>
+    </w:lvl>
+    <w:lvl w:ilvl="8" w:tplc="20000005" w:tentative="1">
+      <w:start w:val="1"/>
+      <w:numFmt w:val="bullet"/>
+      <w:lvlText w:val=""/>
+      <w:lvlJc w:val="left"/>
+      <w:pPr>
+        <w:ind w:left="6840" w:hanging="360"/>
+      </w:pPr>
+      <w:rPr>
+        <w:rFonts w:ascii="Wingdings" w:hAnsi="Wingdings" w:hint="default"/>
+      </w:rPr>
+    </w:lvl>
+  </w:abstractNum>
+  <w:abstractNum w:abstractNumId="4" w15:restartNumberingAfterBreak="0">
     <w:nsid w:val="344155CA"/>
     <w:multiLevelType w:val="multilevel"/>
     <w:tmpl w:val="B936CFAE"/>
@@ -1474,19 +3303,25 @@
     </w:lvl>
   </w:abstractNum>
   <w:num w:numId="1" w16cid:durableId="2135907797">
+    <w:abstractNumId w:val="4"/>
+  </w:num>
+  <w:num w:numId="2" w16cid:durableId="1848909039">
+    <w:abstractNumId w:val="1"/>
+  </w:num>
+  <w:num w:numId="3" w16cid:durableId="1710299913">
     <w:abstractNumId w:val="2"/>
   </w:num>
-  <w:num w:numId="2" w16cid:durableId="1848909039">
+  <w:num w:numId="4" w16cid:durableId="260141142">
     <w:abstractNumId w:val="0"/>
   </w:num>
-  <w:num w:numId="3" w16cid:durableId="1710299913">
-    <w:abstractNumId w:val="1"/>
+  <w:num w:numId="5" w16cid:durableId="1393579962">
+    <w:abstractNumId w:val="3"/>
   </w:num>
 </w:numbering>
 </file>
 
 <file path=word/styles.xml><?xml version="1.0" encoding="utf-8"?>
-<w:styles xmlns:mc="http://schemas.openxmlformats.org/markup-compatibility/2006" xmlns:r="http://schemas.openxmlformats.org/officeDocument/2006/relationships" xmlns:w="http://schemas.openxmlformats.org/wordprocessingml/2006/main" xmlns:w14="http://schemas.microsoft.com/office/word/2010/wordml" xmlns:w15="http://schemas.microsoft.com/office/word/2012/wordml" xmlns:w16cex="http://schemas.microsoft.com/office/word/2018/wordml/cex" xmlns:w16cid="http://schemas.microsoft.com/office/word/2016/wordml/cid" xmlns:w16="http://schemas.microsoft.com/office/word/2018/wordml" xmlns:w16sdtdh="http://schemas.microsoft.com/office/word/2020/wordml/sdtdatahash" xmlns:w16se="http://schemas.microsoft.com/office/word/2015/wordml/symex" mc:Ignorable="w14 w15 w16se w16cid w16 w16cex w16sdtdh">
+<w:styles xmlns:mc="http://schemas.openxmlformats.org/markup-compatibility/2006" xmlns:r="http://schemas.openxmlformats.org/officeDocument/2006/relationships" xmlns:w="http://schemas.openxmlformats.org/wordprocessingml/2006/main" xmlns:w14="http://schemas.microsoft.com/office/word/2010/wordml" xmlns:w15="http://schemas.microsoft.com/office/word/2012/wordml" xmlns:w16cex="http://schemas.microsoft.com/office/word/2018/wordml/cex" xmlns:w16cid="http://schemas.microsoft.com/office/word/2016/wordml/cid" xmlns:w16="http://schemas.microsoft.com/office/word/2018/wordml" xmlns:w16du="http://schemas.microsoft.com/office/word/2023/wordml/word16du" xmlns:w16sdtdh="http://schemas.microsoft.com/office/word/2020/wordml/sdtdatahash" xmlns:w16se="http://schemas.microsoft.com/office/word/2015/wordml/symex" mc:Ignorable="w14 w15 w16se w16cid w16 w16cex w16sdtdh w16du">
   <w:docDefaults>
     <w:rPrDefault>
       <w:rPr>
@@ -1885,6 +3720,7 @@
   <w:style w:type="paragraph" w:default="1" w:styleId="Normal">
     <w:name w:val="Normal"/>
     <w:qFormat/>
+    <w:rsid w:val="007C016C"/>
   </w:style>
   <w:style w:type="paragraph" w:styleId="Heading1">
     <w:name w:val="heading 1"/>
@@ -2697,4 +4533,16 @@
     </a:ext>
   </a:extLst>
 </a:theme>
+</file>
+
+<file path=customXml/item1.xml><?xml version="1.0" encoding="utf-8"?>
+<b:Sources xmlns:b="http://schemas.openxmlformats.org/officeDocument/2006/bibliography" xmlns="http://schemas.openxmlformats.org/officeDocument/2006/bibliography" SelectedStyle="\APASixthEditionOfficeOnline.xsl" StyleName="APA" Version="6"/>
+</file>
+
+<file path=customXml/itemProps1.xml><?xml version="1.0" encoding="utf-8"?>
+<ds:datastoreItem xmlns:ds="http://schemas.openxmlformats.org/officeDocument/2006/customXml" ds:itemID="{D3A590B6-DFE6-4A26-88A9-14BC7FCA699E}">
+  <ds:schemaRefs>
+    <ds:schemaRef ds:uri="http://schemas.openxmlformats.org/officeDocument/2006/bibliography"/>
+  </ds:schemaRefs>
+</ds:datastoreItem>
 </file>
</xml_diff>